<commit_message>
2.2-§: 2021-yil ko‘rsatkichlari 2021-yilgi statistik byulleten bo‘yicha to‘ldirildi
Co-Authored-By: Claude Opus 5.5 <noreply@anthropic.com>
Claude-Session: https://claude.ai/code/session_01PxHTC8Q7yHdrpAeUA5KUgM
</commit_message>
<xml_diff>
--- a/paragraflar/2.2-paragraf.docx
+++ b/paragraflar/2.2-paragraf.docx
@@ -945,7 +945,7 @@
                 <w:rFonts w:ascii="Times New Roman" w:hAnsi="Times New Roman" w:cs="Times New Roman" w:eastAsia="Times New Roman"/>
                 <w:sz w:val="22"/>
               </w:rPr>
-              <w:t xml:space="preserve">–</w:t>
+              <w:t xml:space="preserve">13,2</w:t>
             </w:r>
           </w:p>
         </w:tc>
@@ -1787,7 +1787,7 @@
                 <w:rFonts w:ascii="Times New Roman" w:hAnsi="Times New Roman" w:cs="Times New Roman" w:eastAsia="Times New Roman"/>
                 <w:sz w:val="22"/>
               </w:rPr>
-              <w:t xml:space="preserve">–</w:t>
+              <w:t xml:space="preserve">13,1</w:t>
             </w:r>
           </w:p>
         </w:tc>
@@ -2721,7 +2721,7 @@
                 <w:rFonts w:ascii="Times New Roman" w:hAnsi="Times New Roman" w:cs="Times New Roman" w:eastAsia="Times New Roman"/>
                 <w:sz w:val="22"/>
               </w:rPr>
-              <w:t xml:space="preserve">–</w:t>
+              <w:t xml:space="preserve">42,2</w:t>
             </w:r>
           </w:p>
         </w:tc>
@@ -2846,7 +2846,7 @@
                 <w:rFonts w:ascii="Times New Roman" w:hAnsi="Times New Roman" w:cs="Times New Roman" w:eastAsia="Times New Roman"/>
                 <w:sz w:val="22"/>
               </w:rPr>
-              <w:t xml:space="preserve">48,8¹</w:t>
+              <w:t xml:space="preserve">49,2</w:t>
             </w:r>
           </w:p>
         </w:tc>
@@ -2946,7 +2946,7 @@
           <w:i/>
           <w:sz w:val="28"/>
         </w:rPr>
-        <w:t xml:space="preserve">Izoh: ¹ 2022-yil yanvar holatiga; «–» – byulletenda ma’lumot berilmagan.</w:t>
+        <w:t xml:space="preserve">Izoh: «–» – byulletenda ma’lumot berilmagan.</w:t>
       </w:r>
     </w:p>
     <w:p>
@@ -2961,7 +2961,7 @@
           <w:rFonts w:ascii="Times New Roman" w:hAnsi="Times New Roman" w:cs="Times New Roman" w:eastAsia="Times New Roman"/>
           <w:sz w:val="28"/>
         </w:rPr>
-        <w:t xml:space="preserve">Jadval ma’lumotlari bank tizimining umumiy holatini ijobiy baholash imkonini beradi: kapital va likvidlik ko‘rsatkichlari regulyativ va xalqaro minimumlardan barqaror yuqori, rasmiy muammoli kreditlar ulushi 2021-yildagi 5,2 foizdan 2025-yilda 3 foizgacha pasaygan, depozitlar bilan moliyalashtirish darajasi oshib, xorijiy valyutadagi kreditlar ulushi esa 48,8 foizdan 38,4 foizgacha kamaygan. Biroq ko‘rsatkichlarni chuqurroq tahlil qilish bu umumiy manzara ortida muhim risklar yashiringanini ko‘rsatadi.</w:t>
+        <w:t xml:space="preserve">Jadval ma’lumotlari bank tizimining umumiy holatini ijobiy baholash imkonini beradi: kapital va likvidlik ko‘rsatkichlari regulyativ va xalqaro minimumlardan barqaror yuqori, rasmiy muammoli kreditlar ulushi 2021-yildagi 5,2 foizdan 2025-yilda 3 foizgacha pasaygan, depozitlar bilan moliyalashtirish darajasi oshib, xorijiy valyutadagi kreditlar ulushi esa 49,2 foizdan 38,4 foizgacha kamaygan. Biroq ko‘rsatkichlarni chuqurroq tahlil qilish bu umumiy manzara ortida muhim risklar yashiringanini ko‘rsatadi.</w:t>
       </w:r>
     </w:p>
     <w:p>
@@ -3289,7 +3289,7 @@
           <w:rFonts w:ascii="Times New Roman" w:hAnsi="Times New Roman" w:cs="Times New Roman" w:eastAsia="Times New Roman"/>
           <w:sz w:val="28"/>
         </w:rPr>
-        <w:t xml:space="preserve">, ya’ni muammoli kreditlarning yarmiga yaqini zaxira bilan qoplanmagan. Xalqaro mezonlar bilan solishtirganda, O.I. Lavrushin va I.D. Mamonova erta ogohlantirish signallari qatorida umidsiz kreditlar ulushining 5 foizdan oshishini keltiradi</w:t>
+        <w:t xml:space="preserve">, ya’ni muammoli kreditlarning yarmiga yaqini zaxira bilan qoplanmagan. Shu bilan birga, zaxiralar chegirilgan muammoli kreditlarning kapitalga nisbati 2021-yildagi 13,1 foizdan 2025-yilda 5,7 foizgacha pasaygan, bu esa kredit riskining kapitalga bosimi kamayganini ko‘rsatadi. Xalqaro mezonlar bilan solishtirganda, O.I. Lavrushin va I.D. Mamonova erta ogohlantirish signallari qatorida umidsiz kreditlar ulushining 5 foizdan oshishini keltiradi</w:t>
       </w:r>
       <w:r>
         <w:rPr>
@@ -3453,7 +3453,7 @@
           <w:rFonts w:ascii="Times New Roman" w:hAnsi="Times New Roman" w:cs="Times New Roman" w:eastAsia="Times New Roman"/>
           <w:sz w:val="28"/>
         </w:rPr>
-        <w:t xml:space="preserve">. Bunday tuzilma tashqi moliyalashtirish sharoiti yomonlashganda likvidlik va valyuta riskini oshiradi. Ijobiy tomoni shundaki, depozitlar bilan qoplanish darajasi 2022-yildagi 47,8 foizdan izchil oshib bormoqda, xorijiy valyutadagi kreditlar ulushi esa 38,4 foizgacha kamaygan.</w:t>
+        <w:t xml:space="preserve">. Bunday tuzilma tashqi moliyalashtirish sharoiti yomonlashganda likvidlik va valyuta riskini oshiradi. Ijobiy tomoni shundaki, depozitlar bilan qoplanish darajasi 2021-yildagi 42,2 foizdan izchil oshib bormoqda, xorijiy valyutadagi kreditlar ulushi esa 38,4 foizgacha kamaygan.</w:t>
       </w:r>
     </w:p>
     <w:p>
@@ -8274,7 +8274,7 @@
         <w:t xml:space="preserve"> </w:t>
       </w:r>
       <w:r>
-        <w:t xml:space="preserve">Tadqiqot natijasida muallif tomonidan quyidagi manbalar ma’lumotlari asosida ishlab chiqildi: O‘zbekiston Respublikasi Markaziy banki. Statistik byulleten: 2026-yil mart. – Toshkent, 2026. – 5.1.3, 5.1.4, 5.1.6, 5.1.7, 5.1.8-jadvallar. – https://cbu.uz/uz/statistics/buleten; O‘zbekiston Respublikasi Markaziy banki. Moliyaviy barqarorlik sharhi: 2022-yil. – Toshkent, 2023; The Central Bank of the Republic of Uzbekistan. Financial Stability Report for 2023. – Tashkent, 2024; O‘zbekiston Respublikasi Markaziy banki. 2024-yil uchun moliyaviy barqarorlik sharhi. – Toshkent, 2025; The Central Bank of the Republic of Uzbekistan. Financial Stability Report for 2025. – Tashkent, 2026.</w:t>
+        <w:t xml:space="preserve">Tadqiqot natijasida muallif tomonidan quyidagi manbalar ma’lumotlari asosida ishlab chiqildi: O‘zbekiston Respublikasi Markaziy banki. Statistik byulleten: 2021-yil. – Toshkent, 2022. – 5.1.8b-jadval; O‘zbekiston Respublikasi Markaziy banki. Statistik byulleten: 2026-yil mart. – Toshkent, 2026. – 5.1.3, 5.1.4, 5.1.6, 5.1.7, 5.1.8-jadvallar. – https://cbu.uz/uz/statistics/buleten; O‘zbekiston Respublikasi Markaziy banki. Moliyaviy barqarorlik sharhi: 2022-yil. – Toshkent, 2023; The Central Bank of the Republic of Uzbekistan. Financial Stability Report for 2023. – Tashkent, 2024; O‘zbekiston Respublikasi Markaziy banki. 2024-yil uchun moliyaviy barqarorlik sharhi. – Toshkent, 2025; The Central Bank of the Republic of Uzbekistan. Financial Stability Report for 2025. – Tashkent, 2026.</w:t>
       </w:r>
     </w:p>
   </w:footnote>
@@ -8293,7 +8293,7 @@
         <w:t xml:space="preserve"> </w:t>
       </w:r>
       <w:r>
-        <w:t xml:space="preserve">O‘zbekiston Respublikasi Markaziy banki. Statistik byulleten: 2026-yil mart. – Toshkent, 2026. – 5.1.3, 5.1.4, 5.1.6, 5.1.7, 5.1.8-jadvallar. – https://cbu.uz/uz/statistics/buleten/</w:t>
+        <w:t xml:space="preserve">O‘zbekiston Respublikasi Markaziy banki. Statistik byulleten: 2021-yil. – Toshkent, 2022. – 5.1.8b-jadval; O‘zbekiston Respublikasi Markaziy banki. Statistik byulleten: 2026-yil mart. – Toshkent, 2026. – 5.1.3, 5.1.4, 5.1.6, 5.1.7, 5.1.8-jadvallar. – https://cbu.uz/uz/statistics/buleten/</w:t>
       </w:r>
     </w:p>
   </w:footnote>
@@ -8426,7 +8426,7 @@
         <w:t xml:space="preserve"> </w:t>
       </w:r>
       <w:r>
-        <w:t xml:space="preserve">O‘zbekiston Respublikasi Markaziy banki. Statistik byulleten: 2026-yil mart. – Toshkent, 2026. – 5.1.3, 5.1.4, 5.1.6, 5.1.7, 5.1.8-jadvallar. – https://cbu.uz/uz/statistics/buleten/</w:t>
+        <w:t xml:space="preserve">O‘zbekiston Respublikasi Markaziy banki. Statistik byulleten: 2021-yil. – Toshkent, 2022. – 5.1.8b-jadval; O‘zbekiston Respublikasi Markaziy banki. Statistik byulleten: 2026-yil mart. – Toshkent, 2026. – 5.1.3, 5.1.4, 5.1.6, 5.1.7, 5.1.8-jadvallar. – https://cbu.uz/uz/statistics/buleten/</w:t>
       </w:r>
     </w:p>
   </w:footnote>
@@ -8521,7 +8521,7 @@
         <w:t xml:space="preserve"> </w:t>
       </w:r>
       <w:r>
-        <w:t xml:space="preserve">Tadqiqot natijasida muallif tomonidan quyidagi manbalar ma’lumotlari asosida ishlab chiqildi: O‘zbekiston Respublikasi Markaziy banki. Statistik byulleten: 2026-yil mart. – Toshkent, 2026. – 5.1.3, 5.1.4, 5.1.6, 5.1.7, 5.1.8-jadvallar. – https://cbu.uz/uz/statistics/buleten; O‘zbekiston Respublikasi Markaziy banki. Moliyaviy barqarorlik sharhi: 2022-yil. – Toshkent, 2023; The Central Bank of the Republic of Uzbekistan. Financial Stability Report for 2023. – Tashkent, 2024; O‘zbekiston Respublikasi Markaziy banki. 2024-yil uchun moliyaviy barqarorlik sharhi. – Toshkent, 2025; The Central Bank of the Republic of Uzbekistan. Financial Stability Report for 2025. – Tashkent, 2026; World Bank. Republic of Uzbekistan: Financial Sector Assessment. – Washington, DC: World Bank, 2025.</w:t>
+        <w:t xml:space="preserve">Tadqiqot natijasida muallif tomonidan quyidagi manbalar ma’lumotlari asosida ishlab chiqildi: O‘zbekiston Respublikasi Markaziy banki. Statistik byulleten: 2021-yil. – Toshkent, 2022. – 5.1.8b-jadval; O‘zbekiston Respublikasi Markaziy banki. Statistik byulleten: 2026-yil mart. – Toshkent, 2026. – 5.1.3, 5.1.4, 5.1.6, 5.1.7, 5.1.8-jadvallar. – https://cbu.uz/uz/statistics/buleten; O‘zbekiston Respublikasi Markaziy banki. Moliyaviy barqarorlik sharhi: 2022-yil. – Toshkent, 2023; The Central Bank of the Republic of Uzbekistan. Financial Stability Report for 2023. – Tashkent, 2024; O‘zbekiston Respublikasi Markaziy banki. 2024-yil uchun moliyaviy barqarorlik sharhi. – Toshkent, 2025; The Central Bank of the Republic of Uzbekistan. Financial Stability Report for 2025. – Tashkent, 2026; World Bank. Republic of Uzbekistan: Financial Sector Assessment. – Washington, DC: World Bank, 2025.</w:t>
       </w:r>
     </w:p>
   </w:footnote>
@@ -8540,7 +8540,7 @@
         <w:t xml:space="preserve"> </w:t>
       </w:r>
       <w:r>
-        <w:t xml:space="preserve">O‘zbekiston Respublikasi Markaziy banki. Statistik byulleten: 2026-yil mart. – Toshkent, 2026. – 5.1.3, 5.1.4, 5.1.6, 5.1.7, 5.1.8-jadvallar. – https://cbu.uz/uz/statistics/buleten/</w:t>
+        <w:t xml:space="preserve">O‘zbekiston Respublikasi Markaziy banki. Statistik byulleten: 2021-yil. – Toshkent, 2022. – 5.1.8b-jadval; O‘zbekiston Respublikasi Markaziy banki. Statistik byulleten: 2026-yil mart. – Toshkent, 2026. – 5.1.3, 5.1.4, 5.1.6, 5.1.7, 5.1.8-jadvallar. – https://cbu.uz/uz/statistics/buleten/</w:t>
       </w:r>
     </w:p>
   </w:footnote>
@@ -8597,7 +8597,7 @@
         <w:t xml:space="preserve"> </w:t>
       </w:r>
       <w:r>
-        <w:t xml:space="preserve">O‘zbekiston Respublikasi Markaziy banki. Statistik byulleten: 2026-yil mart. – Toshkent, 2026. – 5.1.3, 5.1.4, 5.1.6, 5.1.7, 5.1.8-jadvallar. – https://cbu.uz/uz/statistics/buleten/</w:t>
+        <w:t xml:space="preserve">O‘zbekiston Respublikasi Markaziy banki. Statistik byulleten: 2021-yil. – Toshkent, 2022. – 5.1.8b-jadval; O‘zbekiston Respublikasi Markaziy banki. Statistik byulleten: 2026-yil mart. – Toshkent, 2026. – 5.1.3, 5.1.4, 5.1.6, 5.1.7, 5.1.8-jadvallar. – https://cbu.uz/uz/statistics/buleten/</w:t>
       </w:r>
     </w:p>
   </w:footnote>
@@ -8654,7 +8654,7 @@
         <w:t xml:space="preserve"> </w:t>
       </w:r>
       <w:r>
-        <w:t xml:space="preserve">O‘zbekiston Respublikasi Markaziy banki. Statistik byulleten: 2026-yil mart. – Toshkent, 2026. – 5.1.3, 5.1.4, 5.1.6, 5.1.7, 5.1.8-jadvallar. – https://cbu.uz/uz/statistics/buleten/</w:t>
+        <w:t xml:space="preserve">O‘zbekiston Respublikasi Markaziy banki. Statistik byulleten: 2021-yil. – Toshkent, 2022. – 5.1.8b-jadval; O‘zbekiston Respublikasi Markaziy banki. Statistik byulleten: 2026-yil mart. – Toshkent, 2026. – 5.1.3, 5.1.4, 5.1.6, 5.1.7, 5.1.8-jadvallar. – https://cbu.uz/uz/statistics/buleten/</w:t>
       </w:r>
     </w:p>
   </w:footnote>
@@ -8673,7 +8673,7 @@
         <w:t xml:space="preserve"> </w:t>
       </w:r>
       <w:r>
-        <w:t xml:space="preserve">O‘zbekiston Respublikasi Markaziy banki. Statistik byulleten: 2026-yil mart. – Toshkent, 2026. – 5.1.3, 5.1.4, 5.1.6, 5.1.7, 5.1.8-jadvallar. – https://cbu.uz/uz/statistics/buleten/</w:t>
+        <w:t xml:space="preserve">O‘zbekiston Respublikasi Markaziy banki. Statistik byulleten: 2021-yil. – Toshkent, 2022. – 5.1.8b-jadval; O‘zbekiston Respublikasi Markaziy banki. Statistik byulleten: 2026-yil mart. – Toshkent, 2026. – 5.1.3, 5.1.4, 5.1.6, 5.1.7, 5.1.8-jadvallar. – https://cbu.uz/uz/statistics/buleten/</w:t>
       </w:r>
     </w:p>
   </w:footnote>
@@ -8844,7 +8844,7 @@
         <w:t xml:space="preserve"> </w:t>
       </w:r>
       <w:r>
-        <w:t xml:space="preserve">Tadqiqot natijasida muallif tomonidan quyidagi manbalar ma’lumotlari asosida ishlab chiqildi: O‘zbekiston Respublikasi Markaziy banki. Statistik byulleten: 2026-yil mart. – Toshkent, 2026. – 5.1.3, 5.1.4, 5.1.6, 5.1.7, 5.1.8-jadvallar. – https://cbu.uz/uz/statistics/buleten; The Central Bank of the Republic of Uzbekistan. Financial Stability Report for 2025. – Tashkent, 2026; World Bank. Republic of Uzbekistan: Financial Sector Assessment. – Washington, DC: World Bank, 2025; «O‘zsanoatqurilishbank» ATB ning Markaziy bankka taqdim etilgan prudensial hisobot shakllari (crs003C, crs003L, crs003O): bank balansi, daromadlar, regulyativ kapital hisob-kitobi, aktivlarni tasniflash va prudensial me’yorlar jadvallari, 2021–2025-yillar 30-dekabr holatiga; «Mikrokreditbank» ATB ning Markaziy bankka taqdim etilgan prudensial hisobot shakllari (crs005C, crs005L, crs005O): bank balansi, daromadlar, regulyativ kapital hisob-kitobi, aktivlarni tasniflash va prudensial me’yorlar jadvallari, 2021–2025-yillar 30-dekabr holatiga; Joint Stock Commercial Bank «Uzbek Industrial and Construction Bank» and its subsidiaries. Consolidated Financial Statements for the year ended 31 December 2025 and Independent Auditor’s Report. – Tashkent, 2026. – P. 28–31.</w:t>
+        <w:t xml:space="preserve">Tadqiqot natijasida muallif tomonidan quyidagi manbalar ma’lumotlari asosida ishlab chiqildi: O‘zbekiston Respublikasi Markaziy banki. Statistik byulleten: 2021-yil. – Toshkent, 2022. – 5.1.8b-jadval; O‘zbekiston Respublikasi Markaziy banki. Statistik byulleten: 2026-yil mart. – Toshkent, 2026. – 5.1.3, 5.1.4, 5.1.6, 5.1.7, 5.1.8-jadvallar. – https://cbu.uz/uz/statistics/buleten; The Central Bank of the Republic of Uzbekistan. Financial Stability Report for 2025. – Tashkent, 2026; World Bank. Republic of Uzbekistan: Financial Sector Assessment. – Washington, DC: World Bank, 2025; «O‘zsanoatqurilishbank» ATB ning Markaziy bankka taqdim etilgan prudensial hisobot shakllari (crs003C, crs003L, crs003O): bank balansi, daromadlar, regulyativ kapital hisob-kitobi, aktivlarni tasniflash va prudensial me’yorlar jadvallari, 2021–2025-yillar 30-dekabr holatiga; «Mikrokreditbank» ATB ning Markaziy bankka taqdim etilgan prudensial hisobot shakllari (crs005C, crs005L, crs005O): bank balansi, daromadlar, regulyativ kapital hisob-kitobi, aktivlarni tasniflash va prudensial me’yorlar jadvallari, 2021–2025-yillar 30-dekabr holatiga; Joint Stock Commercial Bank «Uzbek Industrial and Construction Bank» and its subsidiaries. Consolidated Financial Statements for the year ended 31 December 2025 and Independent Auditor’s Report. – Tashkent, 2026. – P. 28–31.</w:t>
       </w:r>
     </w:p>
   </w:footnote>

</xml_diff>

<commit_message>
2.2-§: 2021-yil uchun zaxiralarning muammoli kreditlarga nisbati (45,9%) XVJ 22/189-hisoboti bo‘yicha qo‘shildi
Co-Authored-By: Claude Opus 5.5 <noreply@anthropic.com>
Claude-Session: https://claude.ai/code/session_01PxHTC8Q7yHdrpAeUA5KUgM
</commit_message>
<xml_diff>
--- a/paragraflar/2.2-paragraf.docx
+++ b/paragraflar/2.2-paragraf.docx
@@ -2,7 +2,7 @@
 <file path=word/document.xml><?xml version="1.0" encoding="utf-8"?>
 <w:document xmlns:w="http://schemas.openxmlformats.org/wordprocessingml/2006/main" xmlns:m="http://schemas.openxmlformats.org/officeDocument/2006/math" xmlns:r="http://schemas.openxmlformats.org/officeDocument/2006/relationships" xmlns:o="urn:schemas-microsoft-com:office:office" xmlns:v="urn:schemas-microsoft-com:vml" xmlns:w10="urn:schemas-microsoft-com:office:word" xmlns:a="http://schemas.openxmlformats.org/drawingml/2006/main" xmlns:pic="http://schemas.openxmlformats.org/drawingml/2006/picture" xmlns:wp="http://schemas.openxmlformats.org/drawingml/2006/wordprocessingDrawing">
   <w:body>
-    <w:bookmarkStart w:id="60" w:name="X637944ed30af1a5c7e12bfca1a7866b67ed51e5"/>
+    <w:bookmarkStart w:id="61" w:name="X637944ed30af1a5c7e12bfca1a7866b67ed51e5"/>
     <w:p>
       <w:pPr>
         <w:pStyle w:val="Heading2"/>
@@ -1662,7 +1662,7 @@
                 <w:rFonts w:ascii="Times New Roman" w:hAnsi="Times New Roman" w:cs="Times New Roman" w:eastAsia="Times New Roman"/>
                 <w:sz w:val="22"/>
               </w:rPr>
-              <w:t xml:space="preserve">–</w:t>
+              <w:t xml:space="preserve">45,9</w:t>
             </w:r>
           </w:p>
         </w:tc>
@@ -3276,7 +3276,7 @@
           <w:rFonts w:ascii="Times New Roman" w:hAnsi="Times New Roman" w:cs="Times New Roman" w:eastAsia="Times New Roman"/>
           <w:sz w:val="28"/>
         </w:rPr>
-        <w:t xml:space="preserve">Rasmiy ko‘rsatkich va MHXS 9 bo‘yicha 3-bosqich kreditlari o‘rtasidagi farq muammoli kredit ta’rifining torligi va restrukturizatsiya qilingan kreditlarni qayta tasniflash qoidalarining yumshoqligi bilan izohlanadi. Bundan tashqari, maxsus zaxiralarning muammoli kreditlarga nisbati 2022–2025-yillarda 36,7–52,6 foizni tashkil etgan</w:t>
+        <w:t xml:space="preserve">Rasmiy ko‘rsatkich va MHXS 9 bo‘yicha 3-bosqich kreditlari o‘rtasidagi farq muammoli kredit ta’rifining torligi va restrukturizatsiya qilingan kreditlarni qayta tasniflash qoidalarining yumshoqligi bilan izohlanadi. Bundan tashqari, maxsus zaxiralarning muammoli kreditlarga nisbati 2021-yilda 45,9 foizni tashkil etgan</w:t>
       </w:r>
       <w:r>
         <w:rPr>
@@ -3289,7 +3289,7 @@
           <w:rFonts w:ascii="Times New Roman" w:hAnsi="Times New Roman" w:cs="Times New Roman" w:eastAsia="Times New Roman"/>
           <w:sz w:val="28"/>
         </w:rPr>
-        <w:t xml:space="preserve">, ya’ni muammoli kreditlarning yarmiga yaqini zaxira bilan qoplanmagan. Shu bilan birga, zaxiralar chegirilgan muammoli kreditlarning kapitalga nisbati 2021-yildagi 13,1 foizdan 2025-yilda 5,7 foizgacha pasaygan, bu esa kredit riskining kapitalga bosimi kamayganini ko‘rsatadi. Xalqaro mezonlar bilan solishtirganda, O.I. Lavrushin va I.D. Mamonova erta ogohlantirish signallari qatorida umidsiz kreditlar ulushining 5 foizdan oshishini keltiradi</w:t>
+        <w:t xml:space="preserve">, 2022–2025-yillarda esa 36,7–52,6 foiz oralig‘ida bo‘lgan</w:t>
       </w:r>
       <w:r>
         <w:rPr>
@@ -3302,13 +3302,26 @@
           <w:rFonts w:ascii="Times New Roman" w:hAnsi="Times New Roman" w:cs="Times New Roman" w:eastAsia="Times New Roman"/>
           <w:sz w:val="28"/>
         </w:rPr>
+        <w:t xml:space="preserve">, ya’ni muammoli kreditlarning yarmiga yaqini zaxira bilan qoplanmagan. Shu bilan birga, zaxiralar chegirilgan muammoli kreditlarning kapitalga nisbati 2021-yildagi 13,1 foizdan 2025-yilda 5,7 foizgacha pasaygan, bu esa kredit riskining kapitalga bosimi kamayganini ko‘rsatadi. Xalqaro mezonlar bilan solishtirganda, O.I. Lavrushin va I.D. Mamonova erta ogohlantirish signallari qatorida umidsiz kreditlar ulushining 5 foizdan oshishini keltiradi</w:t>
+      </w:r>
+      <w:r>
+        <w:rPr>
+          <w:rStyle w:val="FootnoteReference"/>
+        </w:rPr>
+        <w:footnoteReference w:id="45"/>
+      </w:r>
+      <w:r>
+        <w:rPr>
+          <w:rFonts w:ascii="Times New Roman" w:hAnsi="Times New Roman" w:cs="Times New Roman" w:eastAsia="Times New Roman"/>
+          <w:sz w:val="28"/>
+        </w:rPr>
         <w:t xml:space="preserve">, O.I. Lavrushin tahriridagi monografiyada esa ishlamaydigan kreditlar ulushining 10 foizgacha oshishi salbiy vaziyat darakchisi sifatida ko‘rsatiladi</w:t>
       </w:r>
       <w:r>
         <w:rPr>
           <w:rStyle w:val="FootnoteReference"/>
         </w:rPr>
-        <w:footnoteReference w:id="45"/>
+        <w:footnoteReference w:id="46"/>
       </w:r>
       <w:r>
         <w:rPr>
@@ -3336,7 +3349,7 @@
         <w:rPr>
           <w:rStyle w:val="FootnoteReference"/>
         </w:rPr>
-        <w:footnoteReference w:id="46"/>
+        <w:footnoteReference w:id="47"/>
       </w:r>
       <w:r>
         <w:rPr>
@@ -3399,7 +3412,7 @@
         <w:rPr>
           <w:rStyle w:val="FootnoteReference"/>
         </w:rPr>
-        <w:footnoteReference w:id="47"/>
+        <w:footnoteReference w:id="48"/>
       </w:r>
     </w:p>
     <w:p>
@@ -3420,7 +3433,7 @@
         <w:rPr>
           <w:rStyle w:val="FootnoteReference"/>
         </w:rPr>
-        <w:footnoteReference w:id="48"/>
+        <w:footnoteReference w:id="49"/>
       </w:r>
       <w:r>
         <w:rPr>
@@ -3433,7 +3446,7 @@
         <w:rPr>
           <w:rStyle w:val="FootnoteReference"/>
         </w:rPr>
-        <w:footnoteReference w:id="49"/>
+        <w:footnoteReference w:id="50"/>
       </w:r>
       <w:r>
         <w:rPr>
@@ -3446,7 +3459,7 @@
         <w:rPr>
           <w:rStyle w:val="FootnoteReference"/>
         </w:rPr>
-        <w:footnoteReference w:id="50"/>
+        <w:footnoteReference w:id="51"/>
       </w:r>
       <w:r>
         <w:rPr>
@@ -3509,7 +3522,7 @@
         <w:rPr>
           <w:rStyle w:val="FootnoteReference"/>
         </w:rPr>
-        <w:footnoteReference w:id="51"/>
+        <w:footnoteReference w:id="52"/>
       </w:r>
     </w:p>
     <w:tbl>
@@ -6442,7 +6455,7 @@
         <w:rPr>
           <w:rStyle w:val="FootnoteReference"/>
         </w:rPr>
-        <w:footnoteReference w:id="52"/>
+        <w:footnoteReference w:id="53"/>
       </w:r>
     </w:p>
     <w:p>
@@ -6463,7 +6476,7 @@
         <w:rPr>
           <w:rStyle w:val="FootnoteReference"/>
         </w:rPr>
-        <w:footnoteReference w:id="53"/>
+        <w:footnoteReference w:id="54"/>
       </w:r>
       <w:r>
         <w:rPr>
@@ -6534,7 +6547,7 @@
         <w:rPr>
           <w:rStyle w:val="FootnoteReference"/>
         </w:rPr>
-        <w:footnoteReference w:id="54"/>
+        <w:footnoteReference w:id="55"/>
       </w:r>
     </w:p>
     <w:p>
@@ -6555,7 +6568,7 @@
         <w:rPr>
           <w:rStyle w:val="FootnoteReference"/>
         </w:rPr>
-        <w:footnoteReference w:id="55"/>
+        <w:footnoteReference w:id="56"/>
       </w:r>
       <w:r>
         <w:rPr>
@@ -6626,7 +6639,7 @@
         <w:rPr>
           <w:rStyle w:val="FootnoteReference"/>
         </w:rPr>
-        <w:footnoteReference w:id="56"/>
+        <w:footnoteReference w:id="57"/>
       </w:r>
     </w:p>
     <w:p>
@@ -6647,7 +6660,7 @@
         <w:rPr>
           <w:rStyle w:val="FootnoteReference"/>
         </w:rPr>
-        <w:footnoteReference w:id="57"/>
+        <w:footnoteReference w:id="58"/>
       </w:r>
       <w:r>
         <w:rPr>
@@ -6675,7 +6688,7 @@
         <w:rPr>
           <w:rStyle w:val="FootnoteReference"/>
         </w:rPr>
-        <w:footnoteReference w:id="58"/>
+        <w:footnoteReference w:id="59"/>
       </w:r>
       <w:r>
         <w:rPr>
@@ -6738,7 +6751,7 @@
         <w:rPr>
           <w:rStyle w:val="FootnoteReference"/>
         </w:rPr>
-        <w:footnoteReference w:id="59"/>
+        <w:footnoteReference w:id="60"/>
       </w:r>
     </w:p>
     <w:tbl>
@@ -8060,7 +8073,7 @@
         <w:t xml:space="preserve">O‘zbekiston bank tizimi va alohida banklar moliyaviy barqarorlik ko‘rsatkichlarini tadqiq etgan holda xulosa qilish mumkinki, 2021–2025-yillarda bank tizimi jadal o‘sib, davlat banklarining ulushi 81 foizdan 62 foizgacha kamaydi, ammo ular tizimda ustunligicha qolmoqda. Rasmiy ko‘rsatkichlar bo‘yicha kapital va likvidlik Bazel III talablaridan ancha yuqori, biroq aktivlar sifati eng zaif bo‘g‘in bo‘lib qolmoqda: substandart kreditlar ulushi «O‘zsanoatqurilishbank» ATB da uch barobar oshgan, MHXS bo‘yicha qadrsizlangan kreditlar rasmiy ko‘rsatkichdan ikki-uch barobar yuqori. Ijtimoiy yo‘naltirilgan kreditlash bilan shug‘ullanuvchi «Mikrokreditbank» ATB misolida esa past daromadlilik, 2024-yilda yashirin kredit riskining bir yo‘la tan olinishi natijasidagi katta zarar va kapital yetarliligining davlat qayta kapitallashtirishiga bog‘liqligi aniqlandi. Bu o‘z navbatida, ko‘rsatkichlarning turli yo‘nalishdagi signallarini yagona bahoga keltiradigan, aktivlar sifatini MHXS 9 bo‘yicha hisobga oladigan va bankning davlat ko‘magisiz barqarorligini alohida baholaydigan integral metodikani ishlab chiqish zaruriyatini yuzaga keltiradi. Bunday metodika dissertatsiyaning uchinchi bobida taklif etiladi.</w:t>
       </w:r>
     </w:p>
-    <w:bookmarkEnd w:id="60"/>
+    <w:bookmarkEnd w:id="61"/>
     <w:sectPr>
       <w:pgMar w:left="1701" w:right="850" w:top="1134" w:bottom="1134"/>
     </w:sectPr>
@@ -8274,7 +8287,7 @@
         <w:t xml:space="preserve"> </w:t>
       </w:r>
       <w:r>
-        <w:t xml:space="preserve">Tadqiqot natijasida muallif tomonidan quyidagi manbalar ma’lumotlari asosida ishlab chiqildi: O‘zbekiston Respublikasi Markaziy banki. Statistik byulleten: 2021-yil. – Toshkent, 2022. – 5.1.8b-jadval; O‘zbekiston Respublikasi Markaziy banki. Statistik byulleten: 2026-yil mart. – Toshkent, 2026. – 5.1.3, 5.1.4, 5.1.6, 5.1.7, 5.1.8-jadvallar. – https://cbu.uz/uz/statistics/buleten; O‘zbekiston Respublikasi Markaziy banki. Moliyaviy barqarorlik sharhi: 2022-yil. – Toshkent, 2023; The Central Bank of the Republic of Uzbekistan. Financial Stability Report for 2023. – Tashkent, 2024; O‘zbekiston Respublikasi Markaziy banki. 2024-yil uchun moliyaviy barqarorlik sharhi. – Toshkent, 2025; The Central Bank of the Republic of Uzbekistan. Financial Stability Report for 2025. – Tashkent, 2026.</w:t>
+        <w:t xml:space="preserve">Tadqiqot natijasida muallif tomonidan quyidagi manbalar ma’lumotlari asosida ishlab chiqildi: O‘zbekiston Respublikasi Markaziy banki. Statistik byulleten: 2021-yil. – Toshkent, 2022. – 5.1.8b-jadval; O‘zbekiston Respublikasi Markaziy banki. Statistik byulleten: 2026-yil mart. – Toshkent, 2026. – 5.1.3, 5.1.4, 5.1.6, 5.1.7, 5.1.8-jadvallar. – https://cbu.uz/uz/statistics/buleten; International Monetary Fund. Republic of Uzbekistan: 2022 Article IV Consultation – Press Release; Staff Report; and Statement by the Executive Director for the Republic of Uzbekistan. IMF Country Report No. 22/189. – Washington, DC: IMF, 2022. – P. 30 (Table 7); O‘zbekiston Respublikasi Markaziy banki. Moliyaviy barqarorlik sharhi: 2022-yil. – Toshkent, 2023; The Central Bank of the Republic of Uzbekistan. Financial Stability Report for 2023. – Tashkent, 2024; O‘zbekiston Respublikasi Markaziy banki. 2024-yil uchun moliyaviy barqarorlik sharhi. – Toshkent, 2025; The Central Bank of the Republic of Uzbekistan. Financial Stability Report for 2025. – Tashkent, 2026.</w:t>
       </w:r>
     </w:p>
   </w:footnote>
@@ -8540,7 +8553,7 @@
         <w:t xml:space="preserve"> </w:t>
       </w:r>
       <w:r>
-        <w:t xml:space="preserve">O‘zbekiston Respublikasi Markaziy banki. Statistik byulleten: 2021-yil. – Toshkent, 2022. – 5.1.8b-jadval; O‘zbekiston Respublikasi Markaziy banki. Statistik byulleten: 2026-yil mart. – Toshkent, 2026. – 5.1.3, 5.1.4, 5.1.6, 5.1.7, 5.1.8-jadvallar. – https://cbu.uz/uz/statistics/buleten/</w:t>
+        <w:t xml:space="preserve">International Monetary Fund. Republic of Uzbekistan: 2022 Article IV Consultation – Press Release; Staff Report; and Statement by the Executive Director for the Republic of Uzbekistan. IMF Country Report No. 22/189. – Washington, DC: IMF, 2022. – P. 30 (Table 7).</w:t>
       </w:r>
     </w:p>
   </w:footnote>
@@ -8559,7 +8572,7 @@
         <w:t xml:space="preserve"> </w:t>
       </w:r>
       <w:r>
-        <w:t xml:space="preserve">Оценка финансовой устойчивости кредитной организации: учебник / под ред. О.И. Лаврушина, И.Д. Мамоновой. – М.: КНОРУС, 2011. – С. 45.</w:t>
+        <w:t xml:space="preserve">O‘zbekiston Respublikasi Markaziy banki. Statistik byulleten: 2021-yil. – Toshkent, 2022. – 5.1.8b-jadval; O‘zbekiston Respublikasi Markaziy banki. Statistik byulleten: 2026-yil mart. – Toshkent, 2026. – 5.1.3, 5.1.4, 5.1.6, 5.1.7, 5.1.8-jadvallar. – https://cbu.uz/uz/statistics/buleten/</w:t>
       </w:r>
     </w:p>
   </w:footnote>
@@ -8578,7 +8591,7 @@
         <w:t xml:space="preserve"> </w:t>
       </w:r>
       <w:r>
-        <w:t xml:space="preserve">Устойчивость банковской системы и развитие банковской политики: монография / под ред. О.И. Лаврушина. – М.: КНОРУС, 2014. – С. 53.</w:t>
+        <w:t xml:space="preserve">Оценка финансовой устойчивости кредитной организации: учебник / под ред. О.И. Лаврушина, И.Д. Мамоновой. – М.: КНОРУС, 2011. – С. 45.</w:t>
       </w:r>
     </w:p>
   </w:footnote>
@@ -8597,7 +8610,7 @@
         <w:t xml:space="preserve"> </w:t>
       </w:r>
       <w:r>
-        <w:t xml:space="preserve">O‘zbekiston Respublikasi Markaziy banki. Statistik byulleten: 2021-yil. – Toshkent, 2022. – 5.1.8b-jadval; O‘zbekiston Respublikasi Markaziy banki. Statistik byulleten: 2026-yil mart. – Toshkent, 2026. – 5.1.3, 5.1.4, 5.1.6, 5.1.7, 5.1.8-jadvallar. – https://cbu.uz/uz/statistics/buleten/</w:t>
+        <w:t xml:space="preserve">Устойчивость банковской системы и развитие банковской политики: монография / под ред. О.И. Лаврушина. – М.: КНОРУС, 2014. – С. 53.</w:t>
       </w:r>
     </w:p>
   </w:footnote>
@@ -8616,7 +8629,7 @@
         <w:t xml:space="preserve"> </w:t>
       </w:r>
       <w:r>
-        <w:t xml:space="preserve">Tadqiqot natijasida muallif tomonidan 2.2.1-jadval ma’lumotlari asosida ishlab chiqildi.</w:t>
+        <w:t xml:space="preserve">O‘zbekiston Respublikasi Markaziy banki. Statistik byulleten: 2021-yil. – Toshkent, 2022. – 5.1.8b-jadval; O‘zbekiston Respublikasi Markaziy banki. Statistik byulleten: 2026-yil mart. – Toshkent, 2026. – 5.1.3, 5.1.4, 5.1.6, 5.1.7, 5.1.8-jadvallar. – https://cbu.uz/uz/statistics/buleten/</w:t>
       </w:r>
     </w:p>
   </w:footnote>
@@ -8635,7 +8648,7 @@
         <w:t xml:space="preserve"> </w:t>
       </w:r>
       <w:r>
-        <w:t xml:space="preserve">Оценка финансовой устойчивости кредитной организации: учебник / под ред. О.И. Лаврушина, И.Д. Мамоновой. – М.: КНОРУС, 2011. – С. 84–85.</w:t>
+        <w:t xml:space="preserve">Tadqiqot natijasida muallif tomonidan 2.2.1-jadval ma’lumotlari asosida ishlab chiqildi.</w:t>
       </w:r>
     </w:p>
   </w:footnote>
@@ -8654,7 +8667,7 @@
         <w:t xml:space="preserve"> </w:t>
       </w:r>
       <w:r>
-        <w:t xml:space="preserve">O‘zbekiston Respublikasi Markaziy banki. Statistik byulleten: 2021-yil. – Toshkent, 2022. – 5.1.8b-jadval; O‘zbekiston Respublikasi Markaziy banki. Statistik byulleten: 2026-yil mart. – Toshkent, 2026. – 5.1.3, 5.1.4, 5.1.6, 5.1.7, 5.1.8-jadvallar. – https://cbu.uz/uz/statistics/buleten/</w:t>
+        <w:t xml:space="preserve">Оценка финансовой устойчивости кредитной организации: учебник / под ред. О.И. Лаврушина, И.Д. Мамоновой. – М.: КНОРУС, 2011. – С. 84–85.</w:t>
       </w:r>
     </w:p>
   </w:footnote>
@@ -8692,7 +8705,7 @@
         <w:t xml:space="preserve"> </w:t>
       </w:r>
       <w:r>
-        <w:t xml:space="preserve">Tadqiqot natijasida muallif tomonidan quyidagi manbalar ma’lumotlari asosida hisoblandi: «O‘zsanoatqurilishbank» ATB ning Markaziy bankka taqdim etilgan prudensial hisobot shakllari (crs003C, crs003L, crs003O): bank balansi, daromadlar, regulyativ kapital hisob-kitobi, aktivlarni tasniflash va prudensial me’yorlar jadvallari, 2021–2025-yillar 30-dekabr holatiga; «Mikrokreditbank» ATB ning Markaziy bankka taqdim etilgan prudensial hisobot shakllari (crs005C, crs005L, crs005O): bank balansi, daromadlar, regulyativ kapital hisob-kitobi, aktivlarni tasniflash va prudensial me’yorlar jadvallari, 2021–2025-yillar 30-dekabr holatiga.</w:t>
+        <w:t xml:space="preserve">O‘zbekiston Respublikasi Markaziy banki. Statistik byulleten: 2021-yil. – Toshkent, 2022. – 5.1.8b-jadval; O‘zbekiston Respublikasi Markaziy banki. Statistik byulleten: 2026-yil mart. – Toshkent, 2026. – 5.1.3, 5.1.4, 5.1.6, 5.1.7, 5.1.8-jadvallar. – https://cbu.uz/uz/statistics/buleten/</w:t>
       </w:r>
     </w:p>
   </w:footnote>
@@ -8711,7 +8724,7 @@
         <w:t xml:space="preserve"> </w:t>
       </w:r>
       <w:r>
-        <w:t xml:space="preserve">Tadqiqot natijasida muallif tomonidan quyidagi manbalar ma’lumotlari asosida ishlab chiqildi: «O‘zsanoatqurilishbank» ATB ning Markaziy bankka taqdim etilgan prudensial hisobot shakllari (crs003C, crs003L, crs003O): bank balansi, daromadlar, regulyativ kapital hisob-kitobi, aktivlarni tasniflash va prudensial me’yorlar jadvallari, 2021–2025-yillar 30-dekabr holatiga; «Mikrokreditbank» ATB ning Markaziy bankka taqdim etilgan prudensial hisobot shakllari (crs005C, crs005L, crs005O): bank balansi, daromadlar, regulyativ kapital hisob-kitobi, aktivlarni tasniflash va prudensial me’yorlar jadvallari, 2021–2025-yillar 30-dekabr holatiga.</w:t>
+        <w:t xml:space="preserve">Tadqiqot natijasida muallif tomonidan quyidagi manbalar ma’lumotlari asosida hisoblandi: «O‘zsanoatqurilishbank» ATB ning Markaziy bankka taqdim etilgan prudensial hisobot shakllari (crs003C, crs003L, crs003O): bank balansi, daromadlar, regulyativ kapital hisob-kitobi, aktivlarni tasniflash va prudensial me’yorlar jadvallari, 2021–2025-yillar 30-dekabr holatiga; «Mikrokreditbank» ATB ning Markaziy bankka taqdim etilgan prudensial hisobot shakllari (crs005C, crs005L, crs005O): bank balansi, daromadlar, regulyativ kapital hisob-kitobi, aktivlarni tasniflash va prudensial me’yorlar jadvallari, 2021–2025-yillar 30-dekabr holatiga.</w:t>
       </w:r>
     </w:p>
   </w:footnote>
@@ -8730,7 +8743,7 @@
         <w:t xml:space="preserve"> </w:t>
       </w:r>
       <w:r>
-        <w:t xml:space="preserve">Hendrickson J.M. Regulation and Instability in U.S. Commercial Banking: A History of Crises. – Basingstoke: Palgrave Macmillan, 2011. – P. 225–227.</w:t>
+        <w:t xml:space="preserve">Tadqiqot natijasida muallif tomonidan quyidagi manbalar ma’lumotlari asosida ishlab chiqildi: «O‘zsanoatqurilishbank» ATB ning Markaziy bankka taqdim etilgan prudensial hisobot shakllari (crs003C, crs003L, crs003O): bank balansi, daromadlar, regulyativ kapital hisob-kitobi, aktivlarni tasniflash va prudensial me’yorlar jadvallari, 2021–2025-yillar 30-dekabr holatiga; «Mikrokreditbank» ATB ning Markaziy bankka taqdim etilgan prudensial hisobot shakllari (crs005C, crs005L, crs005O): bank balansi, daromadlar, regulyativ kapital hisob-kitobi, aktivlarni tasniflash va prudensial me’yorlar jadvallari, 2021–2025-yillar 30-dekabr holatiga.</w:t>
       </w:r>
     </w:p>
   </w:footnote>
@@ -8749,7 +8762,7 @@
         <w:t xml:space="preserve"> </w:t>
       </w:r>
       <w:r>
-        <w:t xml:space="preserve">Tadqiqot natijasida muallif tomonidan quyidagi manbalar ma’lumotlari asosida ishlab chiqildi: «O‘zsanoatqurilishbank» ATB ning Markaziy bankka taqdim etilgan prudensial hisobot shakllari (crs003C, crs003L, crs003O): bank balansi, daromadlar, regulyativ kapital hisob-kitobi, aktivlarni tasniflash va prudensial me’yorlar jadvallari, 2021–2025-yillar 30-dekabr holatiga; «Mikrokreditbank» ATB ning Markaziy bankka taqdim etilgan prudensial hisobot shakllari (crs005C, crs005L, crs005O): bank balansi, daromadlar, regulyativ kapital hisob-kitobi, aktivlarni tasniflash va prudensial me’yorlar jadvallari, 2021–2025-yillar 30-dekabr holatiga.</w:t>
+        <w:t xml:space="preserve">Hendrickson J.M. Regulation and Instability in U.S. Commercial Banking: A History of Crises. – Basingstoke: Palgrave Macmillan, 2011. – P. 225–227.</w:t>
       </w:r>
     </w:p>
   </w:footnote>
@@ -8768,7 +8781,7 @@
         <w:t xml:space="preserve"> </w:t>
       </w:r>
       <w:r>
-        <w:t xml:space="preserve">Joint Stock Commercial Bank «Uzbek Industrial and Construction Bank» and its subsidiaries. Consolidated Financial Statements for the year ended 31 December 2025 and Independent Auditor’s Report. – Tashkent, 2026. – P. 28–31.</w:t>
+        <w:t xml:space="preserve">Tadqiqot natijasida muallif tomonidan quyidagi manbalar ma’lumotlari asosida ishlab chiqildi: «O‘zsanoatqurilishbank» ATB ning Markaziy bankka taqdim etilgan prudensial hisobot shakllari (crs003C, crs003L, crs003O): bank balansi, daromadlar, regulyativ kapital hisob-kitobi, aktivlarni tasniflash va prudensial me’yorlar jadvallari, 2021–2025-yillar 30-dekabr holatiga; «Mikrokreditbank» ATB ning Markaziy bankka taqdim etilgan prudensial hisobot shakllari (crs005C, crs005L, crs005O): bank balansi, daromadlar, regulyativ kapital hisob-kitobi, aktivlarni tasniflash va prudensial me’yorlar jadvallari, 2021–2025-yillar 30-dekabr holatiga.</w:t>
       </w:r>
     </w:p>
   </w:footnote>
@@ -8787,7 +8800,7 @@
         <w:t xml:space="preserve"> </w:t>
       </w:r>
       <w:r>
-        <w:t xml:space="preserve">Tadqiqot natijasida muallif tomonidan quyidagi manbalar ma’lumotlari asosida ishlab chiqildi: «O‘zsanoatqurilishbank» ATB ning Markaziy bankka taqdim etilgan prudensial hisobot shakllari (crs003C, crs003L, crs003O): bank balansi, daromadlar, regulyativ kapital hisob-kitobi, aktivlarni tasniflash va prudensial me’yorlar jadvallari, 2021–2025-yillar 30-dekabr holatiga; «Mikrokreditbank» ATB ning Markaziy bankka taqdim etilgan prudensial hisobot shakllari (crs005C, crs005L, crs005O): bank balansi, daromadlar, regulyativ kapital hisob-kitobi, aktivlarni tasniflash va prudensial me’yorlar jadvallari, 2021–2025-yillar 30-dekabr holatiga.</w:t>
+        <w:t xml:space="preserve">Joint Stock Commercial Bank «Uzbek Industrial and Construction Bank» and its subsidiaries. Consolidated Financial Statements for the year ended 31 December 2025 and Independent Auditor’s Report. – Tashkent, 2026. – P. 28–31.</w:t>
       </w:r>
     </w:p>
   </w:footnote>
@@ -8806,7 +8819,7 @@
         <w:t xml:space="preserve"> </w:t>
       </w:r>
       <w:r>
-        <w:t xml:space="preserve">«Mikrokreditbank» ATB ning Markaziy bankka taqdim etilgan prudensial hisobot shakllari (crs005C, crs005L, crs005O): bank balansi, daromadlar, regulyativ kapital hisob-kitobi, aktivlarni tasniflash va prudensial me’yorlar jadvallari, 2021–2025-yillar 30-dekabr holatiga.</w:t>
+        <w:t xml:space="preserve">Tadqiqot natijasida muallif tomonidan quyidagi manbalar ma’lumotlari asosida ishlab chiqildi: «O‘zsanoatqurilishbank» ATB ning Markaziy bankka taqdim etilgan prudensial hisobot shakllari (crs003C, crs003L, crs003O): bank balansi, daromadlar, regulyativ kapital hisob-kitobi, aktivlarni tasniflash va prudensial me’yorlar jadvallari, 2021–2025-yillar 30-dekabr holatiga; «Mikrokreditbank» ATB ning Markaziy bankka taqdim etilgan prudensial hisobot shakllari (crs005C, crs005L, crs005O): bank balansi, daromadlar, regulyativ kapital hisob-kitobi, aktivlarni tasniflash va prudensial me’yorlar jadvallari, 2021–2025-yillar 30-dekabr holatiga.</w:t>
       </w:r>
     </w:p>
   </w:footnote>
@@ -8825,11 +8838,30 @@
         <w:t xml:space="preserve"> </w:t>
       </w:r>
       <w:r>
-        <w:t xml:space="preserve">«O‘zsanoatqurilishbank» ATB ning Markaziy bankka taqdim etilgan prudensial hisobot shakllari (crs003C, crs003L, crs003O): bank balansi, daromadlar, regulyativ kapital hisob-kitobi, aktivlarni tasniflash va prudensial me’yorlar jadvallari, 2021–2025-yillar 30-dekabr holatiga.</w:t>
+        <w:t xml:space="preserve">«Mikrokreditbank» ATB ning Markaziy bankka taqdim etilgan prudensial hisobot shakllari (crs005C, crs005L, crs005O): bank balansi, daromadlar, regulyativ kapital hisob-kitobi, aktivlarni tasniflash va prudensial me’yorlar jadvallari, 2021–2025-yillar 30-dekabr holatiga.</w:t>
       </w:r>
     </w:p>
   </w:footnote>
   <w:footnote w:id="59">
+    <w:p>
+      <w:pPr>
+        <w:pStyle w:val="FootnoteText"/>
+      </w:pPr>
+      <w:r>
+        <w:rPr>
+          <w:rStyle w:val="FootnoteReference"/>
+        </w:rPr>
+        <w:footnoteRef/>
+      </w:r>
+      <w:r>
+        <w:t xml:space="preserve"> </w:t>
+      </w:r>
+      <w:r>
+        <w:t xml:space="preserve">«O‘zsanoatqurilishbank» ATB ning Markaziy bankka taqdim etilgan prudensial hisobot shakllari (crs003C, crs003L, crs003O): bank balansi, daromadlar, regulyativ kapital hisob-kitobi, aktivlarni tasniflash va prudensial me’yorlar jadvallari, 2021–2025-yillar 30-dekabr holatiga.</w:t>
+      </w:r>
+    </w:p>
+  </w:footnote>
+  <w:footnote w:id="60">
     <w:p>
       <w:pPr>
         <w:pStyle w:val="FootnoteText"/>

</xml_diff>

<commit_message>
2.2-§: 2023-yil substandart va muammoli kreditlar ulushi 19,5% (Markaziy bank yillik hisoboti 2023)
Co-Authored-By: Claude Opus 5.5 <noreply@anthropic.com>
Claude-Session: https://claude.ai/code/session_01PxHTC8Q7yHdrpAeUA5KUgM
</commit_message>
<xml_diff>
--- a/paragraflar/2.2-paragraf.docx
+++ b/paragraflar/2.2-paragraf.docx
@@ -1577,7 +1577,7 @@
                 <w:rFonts w:ascii="Times New Roman" w:hAnsi="Times New Roman" w:cs="Times New Roman" w:eastAsia="Times New Roman"/>
                 <w:sz w:val="22"/>
               </w:rPr>
-              <w:t xml:space="preserve">~20</w:t>
+              <w:t xml:space="preserve">19,5</w:t>
             </w:r>
           </w:p>
         </w:tc>
@@ -3166,7 +3166,7 @@
           <w:rFonts w:ascii="Times New Roman" w:hAnsi="Times New Roman" w:cs="Times New Roman" w:eastAsia="Times New Roman"/>
           <w:sz w:val="28"/>
         </w:rPr>
-        <w:t xml:space="preserve">, 2023-yilda qariyb 20 foizni</w:t>
+        <w:t xml:space="preserve">, 2023-yil oxirida 19,5 foizni (shundan substandart kreditlar 16 foiz, muammoli kreditlar 3,5 foiz)</w:t>
       </w:r>
       <w:r>
         <w:rPr>
@@ -8287,7 +8287,7 @@
         <w:t xml:space="preserve"> </w:t>
       </w:r>
       <w:r>
-        <w:t xml:space="preserve">Tadqiqot natijasida muallif tomonidan quyidagi manbalar ma’lumotlari asosida ishlab chiqildi: O‘zbekiston Respublikasi Markaziy banki. Statistik byulleten: 2021-yil. – Toshkent, 2022. – 5.1.8b-jadval; O‘zbekiston Respublikasi Markaziy banki. Statistik byulleten: 2026-yil mart. – Toshkent, 2026. – 5.1.2, 5.1.3, 5.1.4, 5.1.6, 5.1.7, 5.1.8-jadvallar. – https://cbu.uz/uz/statistics/buleten; International Monetary Fund. Republic of Uzbekistan: 2022 Article IV Consultation – Press Release; Staff Report; and Statement by the Executive Director for the Republic of Uzbekistan. IMF Country Report No. 22/189. – Washington, DC: IMF, 2022. – P. 30 (Table 7); O‘zbekiston Respublikasi Markaziy banki. Moliyaviy barqarorlik sharhi: 2022-yil. – Toshkent, 2023; The Central Bank of the Republic of Uzbekistan. Financial Stability Report for 2023. – Tashkent, 2024; O‘zbekiston Respublikasi Markaziy banki. 2024-yil uchun moliyaviy barqarorlik sharhi. – Toshkent, 2025; The Central Bank of the Republic of Uzbekistan. Financial Stability Report for 2025. – Tashkent, 2026.</w:t>
+        <w:t xml:space="preserve">Tadqiqot natijasida muallif tomonidan quyidagi manbalar ma’lumotlari asosida ishlab chiqildi: O‘zbekiston Respublikasi Markaziy banki. Statistik byulleten: 2021-yil. – Toshkent, 2022. – 5.1.8b-jadval; O‘zbekiston Respublikasi Markaziy banki. Statistik byulleten: 2026-yil mart. – Toshkent, 2026. – 5.1.2, 5.1.3, 5.1.4, 5.1.6, 5.1.7, 5.1.8-jadvallar. – https://cbu.uz/uz/statistics/buleten; International Monetary Fund. Republic of Uzbekistan: 2022 Article IV Consultation – Press Release; Staff Report; and Statement by the Executive Director for the Republic of Uzbekistan. IMF Country Report No. 22/189. – Washington, DC: IMF, 2022. – P. 30 (Table 7); O‘zbekiston Respublikasi Markaziy banki. Moliyaviy barqarorlik sharhi: 2022-yil. – Toshkent, 2023; The Central Bank of the Republic of Uzbekistan. Annual Report 2023. – Tashkent, 2024. – P. 57; The Central Bank of the Republic of Uzbekistan. Financial Stability Report for 2023. – Tashkent, 2024; O‘zbekiston Respublikasi Markaziy banki. 2024-yil uchun moliyaviy barqarorlik sharhi. – Toshkent, 2025; The Central Bank of the Republic of Uzbekistan. Financial Stability Report for 2025. – Tashkent, 2026.</w:t>
       </w:r>
     </w:p>
   </w:footnote>
@@ -8477,7 +8477,7 @@
         <w:t xml:space="preserve"> </w:t>
       </w:r>
       <w:r>
-        <w:t xml:space="preserve">The Central Bank of the Republic of Uzbekistan. Financial Stability Report for 2023. – Tashkent, 2024.</w:t>
+        <w:t xml:space="preserve">The Central Bank of the Republic of Uzbekistan. Annual Report 2023. – Tashkent, 2024. – P. 57.</w:t>
       </w:r>
     </w:p>
   </w:footnote>
@@ -8534,7 +8534,7 @@
         <w:t xml:space="preserve"> </w:t>
       </w:r>
       <w:r>
-        <w:t xml:space="preserve">Tadqiqot natijasida muallif tomonidan quyidagi manbalar ma’lumotlari asosida ishlab chiqildi: O‘zbekiston Respublikasi Markaziy banki. Statistik byulleten: 2021-yil. – Toshkent, 2022. – 5.1.8b-jadval; O‘zbekiston Respublikasi Markaziy banki. Statistik byulleten: 2026-yil mart. – Toshkent, 2026. – 5.1.2, 5.1.3, 5.1.4, 5.1.6, 5.1.7, 5.1.8-jadvallar. – https://cbu.uz/uz/statistics/buleten; O‘zbekiston Respublikasi Markaziy banki. Moliyaviy barqarorlik sharhi: 2022-yil. – Toshkent, 2023; The Central Bank of the Republic of Uzbekistan. Financial Stability Report for 2023. – Tashkent, 2024; O‘zbekiston Respublikasi Markaziy banki. 2024-yil uchun moliyaviy barqarorlik sharhi. – Toshkent, 2025; The Central Bank of the Republic of Uzbekistan. Financial Stability Report for 2025. – Tashkent, 2026.</w:t>
+        <w:t xml:space="preserve">Tadqiqot natijasida muallif tomonidan quyidagi manbalar ma’lumotlari asosida ishlab chiqildi: O‘zbekiston Respublikasi Markaziy banki. Statistik byulleten: 2021-yil. – Toshkent, 2022. – 5.1.8b-jadval; O‘zbekiston Respublikasi Markaziy banki. Statistik byulleten: 2026-yil mart. – Toshkent, 2026. – 5.1.2, 5.1.3, 5.1.4, 5.1.6, 5.1.7, 5.1.8-jadvallar. – https://cbu.uz/uz/statistics/buleten; O‘zbekiston Respublikasi Markaziy banki. Moliyaviy barqarorlik sharhi: 2022-yil. – Toshkent, 2023; The Central Bank of the Republic of Uzbekistan. Annual Report 2023. – Tashkent, 2024. – P. 57; O‘zbekiston Respublikasi Markaziy banki. 2024-yil uchun moliyaviy barqarorlik sharhi. – Toshkent, 2025; The Central Bank of the Republic of Uzbekistan. Financial Stability Report for 2025. – Tashkent, 2026.</w:t>
       </w:r>
     </w:p>
   </w:footnote>
@@ -11093,7 +11093,7 @@
                   <c:v>15.9</c:v>
                 </c:pt>
                 <c:pt idx="2">
-                  <c:v>20.0</c:v>
+                  <c:v>19.5</c:v>
                 </c:pt>
                 <c:pt idx="3">
                   <c:v>21.0</c:v>

</xml_diff>

<commit_message>
2.2-§: «Mikrokreditbank» MHXS 9 3-bosqich kreditlari (2023–2025) bank MHXS hisobotlaridan qo‘shildi
Co-Authored-By: Claude Opus 5.5 <noreply@anthropic.com>
Claude-Session: https://claude.ai/code/session_01PxHTC8Q7yHdrpAeUA5KUgM
</commit_message>
<xml_diff>
--- a/paragraflar/2.2-paragraf.docx
+++ b/paragraflar/2.2-paragraf.docx
@@ -2,7 +2,7 @@
 <file path=word/document.xml><?xml version="1.0" encoding="utf-8"?>
 <w:document xmlns:w="http://schemas.openxmlformats.org/wordprocessingml/2006/main" xmlns:m="http://schemas.openxmlformats.org/officeDocument/2006/math" xmlns:r="http://schemas.openxmlformats.org/officeDocument/2006/relationships" xmlns:o="urn:schemas-microsoft-com:office:office" xmlns:v="urn:schemas-microsoft-com:vml" xmlns:w10="urn:schemas-microsoft-com:office:word" xmlns:a="http://schemas.openxmlformats.org/drawingml/2006/main" xmlns:pic="http://schemas.openxmlformats.org/drawingml/2006/picture" xmlns:wp="http://schemas.openxmlformats.org/drawingml/2006/wordprocessingDrawing">
   <w:body>
-    <w:bookmarkStart w:id="61" w:name="X637944ed30af1a5c7e12bfca1a7866b67ed51e5"/>
+    <w:bookmarkStart w:id="62" w:name="X637944ed30af1a5c7e12bfca1a7866b67ed51e5"/>
     <w:p>
       <w:pPr>
         <w:pStyle w:val="Heading2"/>
@@ -6575,7 +6575,20 @@
           <w:rFonts w:ascii="Times New Roman" w:hAnsi="Times New Roman" w:cs="Times New Roman" w:eastAsia="Times New Roman"/>
           <w:sz w:val="28"/>
         </w:rPr>
-        <w:t xml:space="preserve">. «Mikrokreditbank» ATB da esa rasmiy muammoli kreditlar ulushining o‘zi 4,4–6,0 foiz bo‘lib, 2021 va 2023-yillarda 5 foizlik erta ogohlantirish chegarasidan oshgan, substandart kreditlar ulushi esa 2023-yilda 24,5 foizga yetgan.</w:t>
+        <w:t xml:space="preserve">. «Mikrokreditbank» ATB da esa rasmiy muammoli kreditlar ulushining o‘zi 4,4–6,0 foiz bo‘lib, 2021 va 2023-yillarda 5 foizlik erta ogohlantirish chegarasidan oshgan, substandart kreditlar ulushi esa 2023-yilda 24,5 foizga yetgan. Bankning MHXS bo‘yicha konsolidatsiyalangan hisoboti bu riskning ko‘lamini yanada aniqroq ko‘rsatadi: amortizatsiyalangan qiymatda baholanadigan kreditlar tarkibida 3-bosqich, ya’ni qadrsizlangan kreditlar ulushi 2023-yilda 16,6 foizni, 2024-yilda 15,2 foizni, 2025-yilda esa 12,3 foizni tashkil etgan</w:t>
+      </w:r>
+      <w:r>
+        <w:rPr>
+          <w:rStyle w:val="FootnoteReference"/>
+        </w:rPr>
+        <w:footnoteReference w:id="57"/>
+      </w:r>
+      <w:r>
+        <w:rPr>
+          <w:rFonts w:ascii="Times New Roman" w:hAnsi="Times New Roman" w:cs="Times New Roman" w:eastAsia="Times New Roman"/>
+          <w:sz w:val="28"/>
+        </w:rPr>
+        <w:t xml:space="preserve">. Demak, MHXS 9 bo‘yicha qadrsizlangan kreditlar ulushi rasmiy muammoli kreditlar ulushidan 2,8–3,3 barobar yuqori bo‘lgan, 2-bosqich kreditlari ulushi ham 2023–2025-yillarda 25–26 foiz atrofida saqlangan.</w:t>
       </w:r>
     </w:p>
     <w:p>
@@ -6639,7 +6652,7 @@
         <w:rPr>
           <w:rStyle w:val="FootnoteReference"/>
         </w:rPr>
-        <w:footnoteReference w:id="57"/>
+        <w:footnoteReference w:id="58"/>
       </w:r>
     </w:p>
     <w:p>
@@ -6660,7 +6673,7 @@
         <w:rPr>
           <w:rStyle w:val="FootnoteReference"/>
         </w:rPr>
-        <w:footnoteReference w:id="58"/>
+        <w:footnoteReference w:id="59"/>
       </w:r>
       <w:r>
         <w:rPr>
@@ -6688,7 +6701,7 @@
         <w:rPr>
           <w:rStyle w:val="FootnoteReference"/>
         </w:rPr>
-        <w:footnoteReference w:id="59"/>
+        <w:footnoteReference w:id="60"/>
       </w:r>
       <w:r>
         <w:rPr>
@@ -6751,7 +6764,7 @@
         <w:rPr>
           <w:rStyle w:val="FootnoteReference"/>
         </w:rPr>
-        <w:footnoteReference w:id="60"/>
+        <w:footnoteReference w:id="61"/>
       </w:r>
     </w:p>
     <w:tbl>
@@ -7372,7 +7385,7 @@
                 <w:rFonts w:ascii="Times New Roman" w:hAnsi="Times New Roman" w:cs="Times New Roman" w:eastAsia="Times New Roman"/>
                 <w:sz w:val="22"/>
               </w:rPr>
-              <w:t xml:space="preserve">–</w:t>
+              <w:t xml:space="preserve">12,3</w:t>
             </w:r>
           </w:p>
         </w:tc>
@@ -8070,10 +8083,10 @@
           <w:rFonts w:ascii="Times New Roman" w:hAnsi="Times New Roman" w:cs="Times New Roman" w:eastAsia="Times New Roman"/>
           <w:sz w:val="28"/>
         </w:rPr>
-        <w:t xml:space="preserve">O‘zbekiston bank tizimi va alohida banklar moliyaviy barqarorlik ko‘rsatkichlarini tadqiq etgan holda xulosa qilish mumkinki, 2021–2025-yillarda bank tizimi jadal o‘sib, davlat banklarining ulushi 81 foizdan 62 foizgacha kamaydi, ammo ular tizimda ustunligicha qolmoqda. Rasmiy ko‘rsatkichlar bo‘yicha kapital va likvidlik Bazel III talablaridan ancha yuqori, biroq aktivlar sifati eng zaif bo‘g‘in bo‘lib qolmoqda: substandart kreditlar ulushi «O‘zsanoatqurilishbank» ATB da uch barobar oshgan, MHXS bo‘yicha qadrsizlangan kreditlar rasmiy ko‘rsatkichdan ikki-uch barobar yuqori. Ijtimoiy yo‘naltirilgan kreditlash bilan shug‘ullanuvchi «Mikrokreditbank» ATB misolida esa past daromadlilik, 2024-yilda yashirin kredit riskining bir yo‘la tan olinishi natijasidagi katta zarar va kapital yetarliligining davlat qayta kapitallashtirishiga bog‘liqligi aniqlandi. Bu o‘z navbatida, ko‘rsatkichlarning turli yo‘nalishdagi signallarini yagona bahoga keltiradigan, aktivlar sifatini MHXS 9 bo‘yicha hisobga oladigan va bankning davlat ko‘magisiz barqarorligini alohida baholaydigan integral metodikani ishlab chiqish zaruriyatini yuzaga keltiradi. Bunday metodika dissertatsiyaning uchinchi bobida taklif etiladi.</w:t>
+        <w:t xml:space="preserve">O‘zbekiston bank tizimi va alohida banklar moliyaviy barqarorlik ko‘rsatkichlarini tadqiq etgan holda xulosa qilish mumkinki, 2021–2025-yillarda bank tizimi jadal o‘sib, davlat banklarining aktivlardagi ulushi 81,5 foizdan 63,5 foizgacha kamaydi, ammo ular tizimda ustunligicha qolmoqda. Rasmiy ko‘rsatkichlar bo‘yicha kapital va likvidlik Bazel III talablaridan ancha yuqori, biroq aktivlar sifati eng zaif bo‘g‘in bo‘lib qolmoqda: substandart kreditlar ulushi «O‘zsanoatqurilishbank» ATB da uch barobar oshgan, MHXS bo‘yicha qadrsizlangan kreditlar rasmiy ko‘rsatkichdan ikki-uch barobar yuqori. Ijtimoiy yo‘naltirilgan kreditlash bilan shug‘ullanuvchi «Mikrokreditbank» ATB misolida esa past daromadlilik, 2024-yilda yashirin kredit riskining bir yo‘la tan olinishi natijasidagi katta zarar va kapital yetarliligining davlat qayta kapitallashtirishiga bog‘liqligi aniqlandi. Bu o‘z navbatida, ko‘rsatkichlarning turli yo‘nalishdagi signallarini yagona bahoga keltiradigan, aktivlar sifatini MHXS 9 bo‘yicha hisobga oladigan va bankning davlat ko‘magisiz barqarorligini alohida baholaydigan integral metodikani ishlab chiqish zaruriyatini yuzaga keltiradi. Bunday metodika dissertatsiyaning uchinchi bobida taklif etiladi.</w:t>
       </w:r>
     </w:p>
-    <w:bookmarkEnd w:id="61"/>
+    <w:bookmarkEnd w:id="62"/>
     <w:sectPr>
       <w:pgMar w:left="1701" w:right="850" w:top="1134" w:bottom="1134"/>
     </w:sectPr>
@@ -8819,7 +8832,7 @@
         <w:t xml:space="preserve"> </w:t>
       </w:r>
       <w:r>
-        <w:t xml:space="preserve">Tadqiqot natijasida muallif tomonidan quyidagi manbalar ma’lumotlari asosida ishlab chiqildi: «O‘zsanoatqurilishbank» ATB ning Markaziy bankka taqdim etilgan prudensial hisobot shakllari (crs003C, crs003L, crs003O): bank balansi, daromadlar, regulyativ kapital hisob-kitobi, aktivlarni tasniflash va prudensial me’yorlar jadvallari, 2021–2025-yillar 30-dekabr holatiga; «Mikrokreditbank» ATB ning Markaziy bankka taqdim etilgan prudensial hisobot shakllari (crs005C, crs005L, crs005O): bank balansi, daromadlar, regulyativ kapital hisob-kitobi, aktivlarni tasniflash va prudensial me’yorlar jadvallari, 2021–2025-yillar 30-dekabr holatiga.</w:t>
+        <w:t xml:space="preserve">Акционерно-коммерческий банк «Микрокредитбанк». Консолидированная финансовая отчетность за год, закончившийся 31 декабря 2024 года, и заключение независимых аудиторов. – Ташкент, 2025. – С. 49–51; Акционерно-коммерческий банк «Микрокредитбанк». Консолидированная финансовая отчетность за год, закончившийся 31 декабря 2025 года, и заключение независимых аудиторов. – Ташкент, 2026. – С. 48. – https://mkbank.uz/uz/shareholders/financial-indicators/audit-report/</w:t>
       </w:r>
     </w:p>
   </w:footnote>
@@ -8838,7 +8851,7 @@
         <w:t xml:space="preserve"> </w:t>
       </w:r>
       <w:r>
-        <w:t xml:space="preserve">«Mikrokreditbank» ATB ning Markaziy bankka taqdim etilgan prudensial hisobot shakllari (crs005C, crs005L, crs005O): bank balansi, daromadlar, regulyativ kapital hisob-kitobi, aktivlarni tasniflash va prudensial me’yorlar jadvallari, 2021–2025-yillar 30-dekabr holatiga.</w:t>
+        <w:t xml:space="preserve">Tadqiqot natijasida muallif tomonidan quyidagi manbalar ma’lumotlari asosida ishlab chiqildi: «O‘zsanoatqurilishbank» ATB ning Markaziy bankka taqdim etilgan prudensial hisobot shakllari (crs003C, crs003L, crs003O): bank balansi, daromadlar, regulyativ kapital hisob-kitobi, aktivlarni tasniflash va prudensial me’yorlar jadvallari, 2021–2025-yillar 30-dekabr holatiga; «Mikrokreditbank» ATB ning Markaziy bankka taqdim etilgan prudensial hisobot shakllari (crs005C, crs005L, crs005O): bank balansi, daromadlar, regulyativ kapital hisob-kitobi, aktivlarni tasniflash va prudensial me’yorlar jadvallari, 2021–2025-yillar 30-dekabr holatiga.</w:t>
       </w:r>
     </w:p>
   </w:footnote>
@@ -8857,7 +8870,7 @@
         <w:t xml:space="preserve"> </w:t>
       </w:r>
       <w:r>
-        <w:t xml:space="preserve">«O‘zsanoatqurilishbank» ATB ning Markaziy bankka taqdim etilgan prudensial hisobot shakllari (crs003C, crs003L, crs003O): bank balansi, daromadlar, regulyativ kapital hisob-kitobi, aktivlarni tasniflash va prudensial me’yorlar jadvallari, 2021–2025-yillar 30-dekabr holatiga.</w:t>
+        <w:t xml:space="preserve">«Mikrokreditbank» ATB ning Markaziy bankka taqdim etilgan prudensial hisobot shakllari (crs005C, crs005L, crs005O): bank balansi, daromadlar, regulyativ kapital hisob-kitobi, aktivlarni tasniflash va prudensial me’yorlar jadvallari, 2021–2025-yillar 30-dekabr holatiga.</w:t>
       </w:r>
     </w:p>
   </w:footnote>
@@ -8876,7 +8889,26 @@
         <w:t xml:space="preserve"> </w:t>
       </w:r>
       <w:r>
-        <w:t xml:space="preserve">Tadqiqot natijasida muallif tomonidan quyidagi manbalar ma’lumotlari asosida ishlab chiqildi: O‘zbekiston Respublikasi Markaziy banki. Statistik byulleten: 2021-yil. – Toshkent, 2022. – 5.1.8b-jadval; O‘zbekiston Respublikasi Markaziy banki. Statistik byulleten: 2026-yil mart. – Toshkent, 2026. – 5.1.2, 5.1.3, 5.1.4, 5.1.6, 5.1.7, 5.1.8-jadvallar. – https://cbu.uz/uz/statistics/buleten; The Central Bank of the Republic of Uzbekistan. Financial Stability Report for 2025. – Tashkent, 2026; World Bank. Republic of Uzbekistan: Financial Sector Assessment. – Washington, DC: World Bank, 2025; «O‘zsanoatqurilishbank» ATB ning Markaziy bankka taqdim etilgan prudensial hisobot shakllari (crs003C, crs003L, crs003O): bank balansi, daromadlar, regulyativ kapital hisob-kitobi, aktivlarni tasniflash va prudensial me’yorlar jadvallari, 2021–2025-yillar 30-dekabr holatiga; «Mikrokreditbank» ATB ning Markaziy bankka taqdim etilgan prudensial hisobot shakllari (crs005C, crs005L, crs005O): bank balansi, daromadlar, regulyativ kapital hisob-kitobi, aktivlarni tasniflash va prudensial me’yorlar jadvallari, 2021–2025-yillar 30-dekabr holatiga; Joint Stock Commercial Bank «Uzbek Industrial and Construction Bank» and its subsidiaries. Consolidated Financial Statements for the year ended 31 December 2025 and Independent Auditor’s Report. – Tashkent, 2026. – P. 28–31.</w:t>
+        <w:t xml:space="preserve">«O‘zsanoatqurilishbank» ATB ning Markaziy bankka taqdim etilgan prudensial hisobot shakllari (crs003C, crs003L, crs003O): bank balansi, daromadlar, regulyativ kapital hisob-kitobi, aktivlarni tasniflash va prudensial me’yorlar jadvallari, 2021–2025-yillar 30-dekabr holatiga.</w:t>
+      </w:r>
+    </w:p>
+  </w:footnote>
+  <w:footnote w:id="61">
+    <w:p>
+      <w:pPr>
+        <w:pStyle w:val="FootnoteText"/>
+      </w:pPr>
+      <w:r>
+        <w:rPr>
+          <w:rStyle w:val="FootnoteReference"/>
+        </w:rPr>
+        <w:footnoteRef/>
+      </w:r>
+      <w:r>
+        <w:t xml:space="preserve"> </w:t>
+      </w:r>
+      <w:r>
+        <w:t xml:space="preserve">Tadqiqot natijasida muallif tomonidan quyidagi manbalar ma’lumotlari asosida ishlab chiqildi: O‘zbekiston Respublikasi Markaziy banki. Statistik byulleten: 2021-yil. – Toshkent, 2022. – 5.1.8b-jadval; O‘zbekiston Respublikasi Markaziy banki. Statistik byulleten: 2026-yil mart. – Toshkent, 2026. – 5.1.2, 5.1.3, 5.1.4, 5.1.6, 5.1.7, 5.1.8-jadvallar. – https://cbu.uz/uz/statistics/buleten; The Central Bank of the Republic of Uzbekistan. Financial Stability Report for 2025. – Tashkent, 2026; World Bank. Republic of Uzbekistan: Financial Sector Assessment. – Washington, DC: World Bank, 2025; «O‘zsanoatqurilishbank» ATB ning Markaziy bankka taqdim etilgan prudensial hisobot shakllari (crs003C, crs003L, crs003O): bank balansi, daromadlar, regulyativ kapital hisob-kitobi, aktivlarni tasniflash va prudensial me’yorlar jadvallari, 2021–2025-yillar 30-dekabr holatiga; «Mikrokreditbank» ATB ning Markaziy bankka taqdim etilgan prudensial hisobot shakllari (crs005C, crs005L, crs005O): bank balansi, daromadlar, regulyativ kapital hisob-kitobi, aktivlarni tasniflash va prudensial me’yorlar jadvallari, 2021–2025-yillar 30-dekabr holatiga; Joint Stock Commercial Bank «Uzbek Industrial and Construction Bank» and its subsidiaries. Consolidated Financial Statements for the year ended 31 December 2025 and Independent Auditor’s Report. – Tashkent, 2026. – P. 28–31; Акционерно-коммерческий банк «Микрокредитбанк». Консолидированная финансовая отчетность за год, закончившийся 31 декабря 2024 года, и заключение независимых аудиторов. – Ташкент, 2025. – С. 49–51; Акционерно-коммерческий банк «Микрокредитбанк». Консолидированная финансовая отчетность за год, закончившийся 31 декабря 2025 года, и заключение независимых аудиторов. – Ташкент, 2026. – С. 48. – https://mkbank.uz/uz/shareholders/financial-indicators/audit-report.</w:t>
       </w:r>
     </w:p>
   </w:footnote>

</xml_diff>

<commit_message>
2.2-§: SQB va Mikrokreditbank MHXS 9 3-bosqich kreditlari 2021–2025 (bank MHXS hisobotlari), yangi 2.2.7-rasm
Co-Authored-By: Claude Opus 5.5 <noreply@anthropic.com>
Claude-Session: https://claude.ai/code/session_01PxHTC8Q7yHdrpAeUA5KUgM
</commit_message>
<xml_diff>
--- a/paragraflar/2.2-paragraf.docx
+++ b/paragraflar/2.2-paragraf.docx
@@ -2,7 +2,7 @@
 <file path=word/document.xml><?xml version="1.0" encoding="utf-8"?>
 <w:document xmlns:w="http://schemas.openxmlformats.org/wordprocessingml/2006/main" xmlns:m="http://schemas.openxmlformats.org/officeDocument/2006/math" xmlns:r="http://schemas.openxmlformats.org/officeDocument/2006/relationships" xmlns:o="urn:schemas-microsoft-com:office:office" xmlns:v="urn:schemas-microsoft-com:vml" xmlns:w10="urn:schemas-microsoft-com:office:word" xmlns:a="http://schemas.openxmlformats.org/drawingml/2006/main" xmlns:pic="http://schemas.openxmlformats.org/drawingml/2006/picture" xmlns:wp="http://schemas.openxmlformats.org/drawingml/2006/wordprocessingDrawing">
   <w:body>
-    <w:bookmarkStart w:id="62" w:name="X637944ed30af1a5c7e12bfca1a7866b67ed51e5"/>
+    <w:bookmarkStart w:id="65" w:name="X637944ed30af1a5c7e12bfca1a7866b67ed51e5"/>
     <w:p>
       <w:pPr>
         <w:pStyle w:val="Heading2"/>
@@ -6575,35 +6575,7 @@
           <w:rFonts w:ascii="Times New Roman" w:hAnsi="Times New Roman" w:cs="Times New Roman" w:eastAsia="Times New Roman"/>
           <w:sz w:val="28"/>
         </w:rPr>
-        <w:t xml:space="preserve">. «Mikrokreditbank» ATB da esa rasmiy muammoli kreditlar ulushining o‘zi 4,4–6,0 foiz bo‘lib, 2021 va 2023-yillarda 5 foizlik erta ogohlantirish chegarasidan oshgan, substandart kreditlar ulushi esa 2023-yilda 24,5 foizga yetgan. Bankning MHXS bo‘yicha konsolidatsiyalangan hisoboti bu riskning ko‘lamini yanada aniqroq ko‘rsatadi: amortizatsiyalangan qiymatda baholanadigan kreditlar tarkibida 3-bosqich, ya’ni qadrsizlangan kreditlar ulushi 2023-yilda 16,6 foizni, 2024-yilda 15,2 foizni, 2025-yilda esa 12,3 foizni tashkil etgan</w:t>
-      </w:r>
-      <w:r>
-        <w:rPr>
-          <w:rStyle w:val="FootnoteReference"/>
-        </w:rPr>
-        <w:footnoteReference w:id="57"/>
-      </w:r>
-      <w:r>
-        <w:rPr>
-          <w:rFonts w:ascii="Times New Roman" w:hAnsi="Times New Roman" w:cs="Times New Roman" w:eastAsia="Times New Roman"/>
-          <w:sz w:val="28"/>
-        </w:rPr>
-        <w:t xml:space="preserve">. Demak, MHXS 9 bo‘yicha qadrsizlangan kreditlar ulushi rasmiy muammoli kreditlar ulushidan 2,8–3,3 barobar yuqori bo‘lgan, 2-bosqich kreditlari ulushi ham 2023–2025-yillarda 25–26 foiz atrofida saqlangan.</w:t>
-      </w:r>
-    </w:p>
-    <w:p>
-      <w:pPr>
-        <w:pStyle w:val="BodyText"/>
-        <w:spacing w:line="360" w:lineRule="auto" w:before="0" w:after="0"/>
-        <w:ind w:firstLine="709"/>
-        <w:jc w:val="both"/>
-      </w:pPr>
-      <w:r>
-        <w:rPr>
-          <w:rFonts w:ascii="Times New Roman" w:hAnsi="Times New Roman" w:cs="Times New Roman" w:eastAsia="Times New Roman"/>
-          <w:sz w:val="28"/>
-        </w:rPr>
-        <w:t xml:space="preserve">Aktivlar sifatidagi bu muammolar «Mikrokreditbank» ATB ning daromadliligiga keskin ta’sir ko‘rsatdi (2.2.7-rasm).</w:t>
+        <w:t xml:space="preserve">. «Mikrokreditbank» ATB da esa rasmiy muammoli kreditlar ulushining o‘zi 4,4–6,0 foiz bo‘lib, 2021 va 2023-yillarda 5 foizlik erta ogohlantirish chegarasidan oshgan, substandart kreditlar ulushi esa 2023-yilda 24,5 foizga yetgan. Rasmiy ko‘rsatkichlarning bu manzarasini ikkala bankning auditdan o‘tgan MHXS bo‘yicha moliyaviy hisobotlari bilan solishtirish kredit riskining haqiqiy ko‘lamini aniqroq ko‘rsatadi (2.2.7-rasm).</w:t>
       </w:r>
     </w:p>
     <w:p>
@@ -6622,7 +6594,125 @@
           <wp:inline distT="0" distB="0" distL="0" distR="0">
             <wp:extent cx="5760000" cy="2880000"/>
             <wp:effectExtent l="0" t="0" r="0" b="0"/>
-            <wp:docPr id="1007" name="2.2.7-rasm"/>
+            <wp:docPr id="1008" name="2.2.7-rasm"/>
+            <wp:cNvGraphicFramePr/>
+            <a:graphic>
+              <a:graphicData uri="http://schemas.openxmlformats.org/drawingml/2006/chart">
+                <c:chart r:id="rId16"/>
+              </a:graphicData>
+            </a:graphic>
+          </wp:inline>
+        </w:drawing>
+      </w:r>
+    </w:p>
+    <w:p>
+      <w:pPr>
+        <w:pStyle w:val="BodyText"/>
+        <w:spacing w:line="240" w:lineRule="auto" w:before="120" w:after="240"/>
+        <w:ind w:firstLine="0"/>
+        <w:jc w:val="center"/>
+      </w:pPr>
+      <w:r>
+        <w:rPr>
+          <w:rFonts w:ascii="Times New Roman" w:hAnsi="Times New Roman" w:cs="Times New Roman" w:eastAsia="Times New Roman"/>
+          <w:b/>
+          <w:sz w:val="28"/>
+        </w:rPr>
+        <w:t xml:space="preserve">2.2.7-rasm. «O‘zsanoatqurilishbank» ATB va «Mikrokreditbank» ATB da MHXS 9 bo‘yicha 3-bosqich kreditlari va rasmiy muammoli kreditlar ulushi, %</w:t>
+      </w:r>
+      <w:r>
+        <w:rPr>
+          <w:rStyle w:val="FootnoteReference"/>
+        </w:rPr>
+        <w:footnoteReference w:id="57"/>
+      </w:r>
+    </w:p>
+    <w:p>
+      <w:pPr>
+        <w:pStyle w:val="BodyText"/>
+        <w:spacing w:line="360" w:lineRule="auto" w:before="0" w:after="0"/>
+        <w:ind w:firstLine="709"/>
+        <w:jc w:val="both"/>
+      </w:pPr>
+      <w:r>
+        <w:rPr>
+          <w:rFonts w:ascii="Times New Roman" w:hAnsi="Times New Roman" w:cs="Times New Roman" w:eastAsia="Times New Roman"/>
+          <w:sz w:val="28"/>
+        </w:rPr>
+        <w:t xml:space="preserve">Rasmdan ko‘rinib turibdiki, ikkala bankda ham MHXS 9 bo‘yicha qadrsizlangan, ya’ni 3-bosqichga tasniflangan kreditlar ulushi tahlil davrining barcha yillarida rasmiy muammoli kreditlar ulushidan yuqori bo‘lgan. «O‘zsanoatqurilishbank» ATB da 3-bosqich kreditlari ulushi 2021–2025-yillarda 4,8–7,5 foiz oralig‘ida bo‘lib, rasmiy ko‘rsatkichdan 1,6–3,0 barobar yuqori bo‘lgan</w:t>
+      </w:r>
+      <w:r>
+        <w:rPr>
+          <w:rStyle w:val="FootnoteReference"/>
+        </w:rPr>
+        <w:footnoteReference w:id="58"/>
+      </w:r>
+      <w:r>
+        <w:rPr>
+          <w:rFonts w:ascii="Times New Roman" w:hAnsi="Times New Roman" w:cs="Times New Roman" w:eastAsia="Times New Roman"/>
+          <w:sz w:val="28"/>
+        </w:rPr>
+        <w:t xml:space="preserve">. Bundan ham muhimi, bankda 2-bosqich, ya’ni kredit riski sezilarli oshgan kreditlar ulushi 2023-yildagi 15,8 foizdan 2024-yilda 27,1 foizga, 2025-yilda esa 35,7 foizga ko‘tarilgan</w:t>
+      </w:r>
+      <w:r>
+        <w:rPr>
+          <w:rStyle w:val="FootnoteReference"/>
+        </w:rPr>
+        <w:footnoteReference w:id="59"/>
+      </w:r>
+      <w:r>
+        <w:rPr>
+          <w:rFonts w:ascii="Times New Roman" w:hAnsi="Times New Roman" w:cs="Times New Roman" w:eastAsia="Times New Roman"/>
+          <w:sz w:val="28"/>
+        </w:rPr>
+        <w:t xml:space="preserve">, bu esa rasmiy hisobotdagi substandart kreditlar ulushining o‘sishi bilan bir yo‘nalishda kechgan. «Mikrokreditbank» ATB da esa 3-bosqich kreditlari ulushi 2021-yilda 17,4 foizni, 2022-yilda 13,5 foizni, 2023-yilda 16,6 foizni, 2024-yilda 15,2 foizni va 2025-yilda 12,3 foizni tashkil etgan, ya’ni rasmiy muammoli kreditlar ulushidan 2,8–3,3 barobar yuqori bo‘lgan, 2-bosqich kreditlari ulushi esa butun davr mobaynida 25–30 foiz atrofida saqlangan</w:t>
+      </w:r>
+      <w:r>
+        <w:rPr>
+          <w:rStyle w:val="FootnoteReference"/>
+        </w:rPr>
+        <w:footnoteReference w:id="60"/>
+      </w:r>
+      <w:r>
+        <w:rPr>
+          <w:rFonts w:ascii="Times New Roman" w:hAnsi="Times New Roman" w:cs="Times New Roman" w:eastAsia="Times New Roman"/>
+          <w:sz w:val="28"/>
+        </w:rPr>
+        <w:t xml:space="preserve">. Demak, milliy hisobot ma’lumotlari asosida hisoblangan muammoli kreditlar ko‘rsatkichi har ikki bankda ham kredit riskini muntazam ravishda kamsitib ko‘rsatadi, bu farq esa davlat ulushi yuqori va imtiyozli kreditlash ko‘p bo‘lgan bankda ayniqsa katta.</w:t>
+      </w:r>
+    </w:p>
+    <w:p>
+      <w:pPr>
+        <w:pStyle w:val="BodyText"/>
+        <w:spacing w:line="360" w:lineRule="auto" w:before="0" w:after="0"/>
+        <w:ind w:firstLine="709"/>
+        <w:jc w:val="both"/>
+      </w:pPr>
+      <w:r>
+        <w:rPr>
+          <w:rFonts w:ascii="Times New Roman" w:hAnsi="Times New Roman" w:cs="Times New Roman" w:eastAsia="Times New Roman"/>
+          <w:sz w:val="28"/>
+        </w:rPr>
+        <w:t xml:space="preserve">Aktivlar sifatidagi bu muammolar «Mikrokreditbank» ATB ning daromadliligiga keskin ta’sir ko‘rsatdi (2.2.8-rasm).</w:t>
+      </w:r>
+    </w:p>
+    <w:p>
+      <w:pPr>
+        <w:pStyle w:val="BodyText"/>
+        <w:keepNext/>
+        <w:spacing w:line="240" w:lineRule="auto" w:before="0" w:after="0"/>
+        <w:ind w:firstLine="0"/>
+        <w:jc w:val="center"/>
+      </w:pPr>
+      <w:r xmlns:c="http://schemas.openxmlformats.org/drawingml/2006/chart">
+        <w:rPr>
+          <w:noProof/>
+        </w:rPr>
+        <w:drawing>
+          <wp:inline distT="0" distB="0" distL="0" distR="0">
+            <wp:extent cx="5760000" cy="2880000"/>
+            <wp:effectExtent l="0" t="0" r="0" b="0"/>
+            <wp:docPr id="1007" name="2.2.8-rasm"/>
             <wp:cNvGraphicFramePr/>
             <a:graphic>
               <a:graphicData uri="http://schemas.openxmlformats.org/drawingml/2006/chart">
@@ -6646,13 +6736,13 @@
           <w:b/>
           <w:sz w:val="28"/>
         </w:rPr>
-        <w:t xml:space="preserve">2.2.7-rasm. «O‘zsanoatqurilishbank» ATB va «Mikrokreditbank» ATB da kapital rentabelligi (ROE), %</w:t>
+        <w:t xml:space="preserve">2.2.8-rasm. «O‘zsanoatqurilishbank» ATB va «Mikrokreditbank» ATB da kapital rentabelligi (ROE), %</w:t>
       </w:r>
       <w:r>
         <w:rPr>
           <w:rStyle w:val="FootnoteReference"/>
         </w:rPr>
-        <w:footnoteReference w:id="58"/>
+        <w:footnoteReference w:id="61"/>
       </w:r>
     </w:p>
     <w:p>
@@ -6673,7 +6763,7 @@
         <w:rPr>
           <w:rStyle w:val="FootnoteReference"/>
         </w:rPr>
-        <w:footnoteReference w:id="59"/>
+        <w:footnoteReference w:id="62"/>
       </w:r>
       <w:r>
         <w:rPr>
@@ -6701,7 +6791,7 @@
         <w:rPr>
           <w:rStyle w:val="FootnoteReference"/>
         </w:rPr>
-        <w:footnoteReference w:id="60"/>
+        <w:footnoteReference w:id="63"/>
       </w:r>
       <w:r>
         <w:rPr>
@@ -6764,7 +6854,7 @@
         <w:rPr>
           <w:rStyle w:val="FootnoteReference"/>
         </w:rPr>
-        <w:footnoteReference w:id="61"/>
+        <w:footnoteReference w:id="64"/>
       </w:r>
     </w:p>
     <w:tbl>
@@ -8086,7 +8176,7 @@
         <w:t xml:space="preserve">O‘zbekiston bank tizimi va alohida banklar moliyaviy barqarorlik ko‘rsatkichlarini tadqiq etgan holda xulosa qilish mumkinki, 2021–2025-yillarda bank tizimi jadal o‘sib, davlat banklarining aktivlardagi ulushi 81,5 foizdan 63,5 foizgacha kamaydi, ammo ular tizimda ustunligicha qolmoqda. Rasmiy ko‘rsatkichlar bo‘yicha kapital va likvidlik Bazel III talablaridan ancha yuqori, biroq aktivlar sifati eng zaif bo‘g‘in bo‘lib qolmoqda: substandart kreditlar ulushi «O‘zsanoatqurilishbank» ATB da uch barobar oshgan, MHXS bo‘yicha qadrsizlangan kreditlar rasmiy ko‘rsatkichdan ikki-uch barobar yuqori. Ijtimoiy yo‘naltirilgan kreditlash bilan shug‘ullanuvchi «Mikrokreditbank» ATB misolida esa past daromadlilik, 2024-yilda yashirin kredit riskining bir yo‘la tan olinishi natijasidagi katta zarar va kapital yetarliligining davlat qayta kapitallashtirishiga bog‘liqligi aniqlandi. Bu o‘z navbatida, ko‘rsatkichlarning turli yo‘nalishdagi signallarini yagona bahoga keltiradigan, aktivlar sifatini MHXS 9 bo‘yicha hisobga oladigan va bankning davlat ko‘magisiz barqarorligini alohida baholaydigan integral metodikani ishlab chiqish zaruriyatini yuzaga keltiradi. Bunday metodika dissertatsiyaning uchinchi bobida taklif etiladi.</w:t>
       </w:r>
     </w:p>
-    <w:bookmarkEnd w:id="62"/>
+    <w:bookmarkEnd w:id="65"/>
     <w:sectPr>
       <w:pgMar w:left="1701" w:right="850" w:top="1134" w:bottom="1134"/>
     </w:sectPr>
@@ -8832,7 +8922,7 @@
         <w:t xml:space="preserve"> </w:t>
       </w:r>
       <w:r>
-        <w:t xml:space="preserve">Акционерно-коммерческий банк «Микрокредитбанк». Консолидированная финансовая отчетность за год, закончившийся 31 декабря 2024 года, и заключение независимых аудиторов. – Ташкент, 2025. – С. 49–51; Акционерно-коммерческий банк «Микрокредитбанк». Консолидированная финансовая отчетность за год, закончившийся 31 декабря 2025 года, и заключение независимых аудиторов. – Ташкент, 2026. – С. 48. – https://mkbank.uz/uz/shareholders/financial-indicators/audit-report/</w:t>
+        <w:t xml:space="preserve">Tadqiqot natijasida muallif tomonidan quyidagi manbalar ma’lumotlari asosida ishlab chiqildi: «O‘zsanoatqurilishbank» ATB ning Markaziy bankka taqdim etilgan prudensial hisobot shakllari (crs003C, crs003L, crs003O): bank balansi, daromadlar, regulyativ kapital hisob-kitobi, aktivlarni tasniflash va prudensial me’yorlar jadvallari, 2021–2025-yillar 30-dekabr holatiga; «Mikrokreditbank» ATB ning Markaziy bankka taqdim etilgan prudensial hisobot shakllari (crs005C, crs005L, crs005O): bank balansi, daromadlar, regulyativ kapital hisob-kitobi, aktivlarni tasniflash va prudensial me’yorlar jadvallari, 2021–2025-yillar 30-dekabr holatiga; Акционерный коммерческий банк «Узбекский промышленно-строительный банк» и его дочерние организации. Консолидированная финансовая отчетность и аудиторское заключение за годы, закончившиеся 31 декабря 2023, 2022 и 2021 гг. – Ташкент, 2024. – С. 40; Joint Stock Commercial Bank «Uzbek Industrial and Construction Bank» and its subsidiaries. Consolidated Financial Statements for the year ended 31 December 2025 and Independent Auditor’s Report. – Tashkent, 2026. – P. 28–31; Акционерно-коммерческий банк «Микрокредитбанк». Консолидированная финансовая отчетность за год, закончившийся 31 декабря 2024 года, и заключение независимых аудиторов. – Ташкент, 2025. – С. 49–51; Акционерно-коммерческий банк «Микрокредитбанк». Финансовая отчетность за год, закончившийся 31 декабря 2022 года, и заключение независимых аудиторов. – Ташкент, 2023. – С. 42–43; Акционерно-коммерческий банк «Микрокредитбанк». Консолидированная финансовая отчетность за год, закончившийся 31 декабря 2025 года, и заключение независимых аудиторов. – Ташкент, 2026. – С. 48. – https://mkbank.uz/uz/shareholders/financial-indicators/audit-report.</w:t>
       </w:r>
     </w:p>
   </w:footnote>
@@ -8851,7 +8941,7 @@
         <w:t xml:space="preserve"> </w:t>
       </w:r>
       <w:r>
-        <w:t xml:space="preserve">Tadqiqot natijasida muallif tomonidan quyidagi manbalar ma’lumotlari asosida ishlab chiqildi: «O‘zsanoatqurilishbank» ATB ning Markaziy bankka taqdim etilgan prudensial hisobot shakllari (crs003C, crs003L, crs003O): bank balansi, daromadlar, regulyativ kapital hisob-kitobi, aktivlarni tasniflash va prudensial me’yorlar jadvallari, 2021–2025-yillar 30-dekabr holatiga; «Mikrokreditbank» ATB ning Markaziy bankka taqdim etilgan prudensial hisobot shakllari (crs005C, crs005L, crs005O): bank balansi, daromadlar, regulyativ kapital hisob-kitobi, aktivlarni tasniflash va prudensial me’yorlar jadvallari, 2021–2025-yillar 30-dekabr holatiga.</w:t>
+        <w:t xml:space="preserve">Акционерный коммерческий банк «Узбекский промышленно-строительный банк» и его дочерние организации. Консолидированная финансовая отчетность и аудиторское заключение за годы, закончившиеся 31 декабря 2023, 2022 и 2021 гг. – Ташкент, 2024. – С. 40.</w:t>
       </w:r>
     </w:p>
   </w:footnote>
@@ -8870,7 +8960,7 @@
         <w:t xml:space="preserve"> </w:t>
       </w:r>
       <w:r>
-        <w:t xml:space="preserve">«Mikrokreditbank» ATB ning Markaziy bankka taqdim etilgan prudensial hisobot shakllari (crs005C, crs005L, crs005O): bank balansi, daromadlar, regulyativ kapital hisob-kitobi, aktivlarni tasniflash va prudensial me’yorlar jadvallari, 2021–2025-yillar 30-dekabr holatiga.</w:t>
+        <w:t xml:space="preserve">Joint Stock Commercial Bank «Uzbek Industrial and Construction Bank» and its subsidiaries. Consolidated Financial Statements for the year ended 31 December 2025 and Independent Auditor’s Report. – Tashkent, 2026. – P. 28–31.</w:t>
       </w:r>
     </w:p>
   </w:footnote>
@@ -8889,7 +8979,7 @@
         <w:t xml:space="preserve"> </w:t>
       </w:r>
       <w:r>
-        <w:t xml:space="preserve">«O‘zsanoatqurilishbank» ATB ning Markaziy bankka taqdim etilgan prudensial hisobot shakllari (crs003C, crs003L, crs003O): bank balansi, daromadlar, regulyativ kapital hisob-kitobi, aktivlarni tasniflash va prudensial me’yorlar jadvallari, 2021–2025-yillar 30-dekabr holatiga.</w:t>
+        <w:t xml:space="preserve">Акционерно-коммерческий банк «Микрокредитбанк». Консолидированная финансовая отчетность за год, закончившийся 31 декабря 2024 года, и заключение независимых аудиторов. – Ташкент, 2025. – С. 49–51; Акционерно-коммерческий банк «Микрокредитбанк». Финансовая отчетность за год, закончившийся 31 декабря 2022 года, и заключение независимых аудиторов. – Ташкент, 2023. – С. 42–43; Акционерно-коммерческий банк «Микрокредитбанк». Консолидированная финансовая отчетность за год, закончившийся 31 декабря 2025 года, и заключение независимых аудиторов. – Ташкент, 2026. – С. 48. – https://mkbank.uz/uz/shareholders/financial-indicators/audit-report/</w:t>
       </w:r>
     </w:p>
   </w:footnote>
@@ -8908,7 +8998,64 @@
         <w:t xml:space="preserve"> </w:t>
       </w:r>
       <w:r>
-        <w:t xml:space="preserve">Tadqiqot natijasida muallif tomonidan quyidagi manbalar ma’lumotlari asosida ishlab chiqildi: O‘zbekiston Respublikasi Markaziy banki. Statistik byulleten: 2021-yil. – Toshkent, 2022. – 5.1.8b-jadval; O‘zbekiston Respublikasi Markaziy banki. Statistik byulleten: 2026-yil mart. – Toshkent, 2026. – 5.1.2, 5.1.3, 5.1.4, 5.1.6, 5.1.7, 5.1.8-jadvallar. – https://cbu.uz/uz/statistics/buleten; The Central Bank of the Republic of Uzbekistan. Financial Stability Report for 2025. – Tashkent, 2026; World Bank. Republic of Uzbekistan: Financial Sector Assessment. – Washington, DC: World Bank, 2025; «O‘zsanoatqurilishbank» ATB ning Markaziy bankka taqdim etilgan prudensial hisobot shakllari (crs003C, crs003L, crs003O): bank balansi, daromadlar, regulyativ kapital hisob-kitobi, aktivlarni tasniflash va prudensial me’yorlar jadvallari, 2021–2025-yillar 30-dekabr holatiga; «Mikrokreditbank» ATB ning Markaziy bankka taqdim etilgan prudensial hisobot shakllari (crs005C, crs005L, crs005O): bank balansi, daromadlar, regulyativ kapital hisob-kitobi, aktivlarni tasniflash va prudensial me’yorlar jadvallari, 2021–2025-yillar 30-dekabr holatiga; Joint Stock Commercial Bank «Uzbek Industrial and Construction Bank» and its subsidiaries. Consolidated Financial Statements for the year ended 31 December 2025 and Independent Auditor’s Report. – Tashkent, 2026. – P. 28–31; Акционерно-коммерческий банк «Микрокредитбанк». Консолидированная финансовая отчетность за год, закончившийся 31 декабря 2024 года, и заключение независимых аудиторов. – Ташкент, 2025. – С. 49–51; Акционерно-коммерческий банк «Микрокредитбанк». Консолидированная финансовая отчетность за год, закончившийся 31 декабря 2025 года, и заключение независимых аудиторов. – Ташкент, 2026. – С. 48. – https://mkbank.uz/uz/shareholders/financial-indicators/audit-report.</w:t>
+        <w:t xml:space="preserve">Tadqiqot natijasida muallif tomonidan quyidagi manbalar ma’lumotlari asosida ishlab chiqildi: «O‘zsanoatqurilishbank» ATB ning Markaziy bankka taqdim etilgan prudensial hisobot shakllari (crs003C, crs003L, crs003O): bank balansi, daromadlar, regulyativ kapital hisob-kitobi, aktivlarni tasniflash va prudensial me’yorlar jadvallari, 2021–2025-yillar 30-dekabr holatiga; «Mikrokreditbank» ATB ning Markaziy bankka taqdim etilgan prudensial hisobot shakllari (crs005C, crs005L, crs005O): bank balansi, daromadlar, regulyativ kapital hisob-kitobi, aktivlarni tasniflash va prudensial me’yorlar jadvallari, 2021–2025-yillar 30-dekabr holatiga.</w:t>
+      </w:r>
+    </w:p>
+  </w:footnote>
+  <w:footnote w:id="62">
+    <w:p>
+      <w:pPr>
+        <w:pStyle w:val="FootnoteText"/>
+      </w:pPr>
+      <w:r>
+        <w:rPr>
+          <w:rStyle w:val="FootnoteReference"/>
+        </w:rPr>
+        <w:footnoteRef/>
+      </w:r>
+      <w:r>
+        <w:t xml:space="preserve"> </w:t>
+      </w:r>
+      <w:r>
+        <w:t xml:space="preserve">«Mikrokreditbank» ATB ning Markaziy bankka taqdim etilgan prudensial hisobot shakllari (crs005C, crs005L, crs005O): bank balansi, daromadlar, regulyativ kapital hisob-kitobi, aktivlarni tasniflash va prudensial me’yorlar jadvallari, 2021–2025-yillar 30-dekabr holatiga.</w:t>
+      </w:r>
+    </w:p>
+  </w:footnote>
+  <w:footnote w:id="63">
+    <w:p>
+      <w:pPr>
+        <w:pStyle w:val="FootnoteText"/>
+      </w:pPr>
+      <w:r>
+        <w:rPr>
+          <w:rStyle w:val="FootnoteReference"/>
+        </w:rPr>
+        <w:footnoteRef/>
+      </w:r>
+      <w:r>
+        <w:t xml:space="preserve"> </w:t>
+      </w:r>
+      <w:r>
+        <w:t xml:space="preserve">«O‘zsanoatqurilishbank» ATB ning Markaziy bankka taqdim etilgan prudensial hisobot shakllari (crs003C, crs003L, crs003O): bank balansi, daromadlar, regulyativ kapital hisob-kitobi, aktivlarni tasniflash va prudensial me’yorlar jadvallari, 2021–2025-yillar 30-dekabr holatiga.</w:t>
+      </w:r>
+    </w:p>
+  </w:footnote>
+  <w:footnote w:id="64">
+    <w:p>
+      <w:pPr>
+        <w:pStyle w:val="FootnoteText"/>
+      </w:pPr>
+      <w:r>
+        <w:rPr>
+          <w:rStyle w:val="FootnoteReference"/>
+        </w:rPr>
+        <w:footnoteRef/>
+      </w:r>
+      <w:r>
+        <w:t xml:space="preserve"> </w:t>
+      </w:r>
+      <w:r>
+        <w:t xml:space="preserve">Tadqiqot natijasida muallif tomonidan quyidagi manbalar ma’lumotlari asosida ishlab chiqildi: O‘zbekiston Respublikasi Markaziy banki. Statistik byulleten: 2021-yil. – Toshkent, 2022. – 5.1.8b-jadval; O‘zbekiston Respublikasi Markaziy banki. Statistik byulleten: 2026-yil mart. – Toshkent, 2026. – 5.1.2, 5.1.3, 5.1.4, 5.1.6, 5.1.7, 5.1.8-jadvallar. – https://cbu.uz/uz/statistics/buleten; The Central Bank of the Republic of Uzbekistan. Financial Stability Report for 2025. – Tashkent, 2026; World Bank. Republic of Uzbekistan: Financial Sector Assessment. – Washington, DC: World Bank, 2025; «O‘zsanoatqurilishbank» ATB ning Markaziy bankka taqdim etilgan prudensial hisobot shakllari (crs003C, crs003L, crs003O): bank balansi, daromadlar, regulyativ kapital hisob-kitobi, aktivlarni tasniflash va prudensial me’yorlar jadvallari, 2021–2025-yillar 30-dekabr holatiga; «Mikrokreditbank» ATB ning Markaziy bankka taqdim etilgan prudensial hisobot shakllari (crs005C, crs005L, crs005O): bank balansi, daromadlar, regulyativ kapital hisob-kitobi, aktivlarni tasniflash va prudensial me’yorlar jadvallari, 2021–2025-yillar 30-dekabr holatiga; Joint Stock Commercial Bank «Uzbek Industrial and Construction Bank» and its subsidiaries. Consolidated Financial Statements for the year ended 31 December 2025 and Independent Auditor’s Report. – Tashkent, 2026. – P. 28–31; Акционерно-коммерческий банк «Микрокредитбанк». Консолидированная финансовая отчетность за год, закончившийся 31 декабря 2024 года, и заключение независимых аудиторов. – Ташкент, 2025. – С. 49–51; Акционерно-коммерческий банк «Микрокредитбанк». Финансовая отчетность за год, закончившийся 31 декабря 2022 года, и заключение независимых аудиторов. – Ташкент, 2023. – С. 42–43; Акционерно-коммерческий банк «Микрокредитбанк». Консолидированная финансовая отчетность за год, закончившийся 31 декабря 2025 года, и заключение независимых аудиторов. – Ташкент, 2026. – С. 48. – https://mkbank.uz/uz/shareholders/financial-indicators/audit-report.</w:t>
       </w:r>
     </w:p>
   </w:footnote>
@@ -13313,6 +13460,624 @@
 </c:chartSpace>
 </file>
 
+<file path=word/charts/chart8.xml><?xml version="1.0" encoding="utf-8"?>
+<c:chartSpace xmlns:c="http://schemas.openxmlformats.org/drawingml/2006/chart" xmlns:a="http://schemas.openxmlformats.org/drawingml/2006/main" xmlns:r="http://schemas.openxmlformats.org/officeDocument/2006/relationships">
+  <c:date1904 val="0"/>
+  <c:lang val="uz-Latn-UZ"/>
+  <c:roundedCorners val="0"/>
+  <c:chart>
+    <c:autoTitleDeleted val="1"/>
+    <c:plotArea>
+      <c:layout/>
+      <c:barChart>
+        <c:barDir val="col"/>
+        <c:grouping val="clustered"/>
+        <c:varyColors val="0"/>
+        <c:ser>
+          <c:idx val="0"/>
+          <c:order val="0"/>
+          <c:tx>
+            <c:strRef>
+              <c:f>Sheet1!$B$1</c:f>
+              <c:strCache>
+                <c:ptCount val="1"/>
+                <c:pt idx="0">
+                  <c:v>SQB: rasmiy muammoli kreditlar</c:v>
+                </c:pt>
+              </c:strCache>
+            </c:strRef>
+          </c:tx>
+          <c:spPr>
+            <a:solidFill>
+              <a:srgbClr val="9DC3E6"/>
+            </a:solidFill>
+            <a:ln w="6350">
+              <a:solidFill>
+                <a:srgbClr val="FFFFFF"/>
+              </a:solidFill>
+            </a:ln>
+          </c:spPr>
+          <c:invertIfNegative val="0"/>
+          <c:dLbls>
+            <c:numFmt formatCode="0.0" sourceLinked="0"/>
+            <c:spPr>
+              <a:noFill/>
+              <a:ln>
+                <a:noFill/>
+              </a:ln>
+            </c:spPr>
+            <c:txPr>
+              <a:bodyPr/>
+              <a:lstStyle/>
+              <a:p>
+                <a:pPr>
+                  <a:defRPr sz="1050" b="1">
+                    <a:solidFill>
+                      <a:srgbClr val="000000"/>
+                    </a:solidFill>
+                    <a:latin typeface="Times New Roman"/>
+                    <a:cs typeface="Times New Roman"/>
+                  </a:defRPr>
+                </a:pPr>
+                <a:endParaRPr lang="uz-Latn-UZ"/>
+              </a:p>
+            </c:txPr>
+            <c:dLblPos val="outEnd"/>
+            <c:showLegendKey val="0"/>
+            <c:showVal val="1"/>
+            <c:showCatName val="0"/>
+            <c:showSerName val="0"/>
+            <c:showPercent val="0"/>
+            <c:showBubbleSize val="0"/>
+          </c:dLbls>
+          <c:cat>
+            <c:strRef>
+              <c:f>Sheet1!$A$2:$A$6</c:f>
+              <c:strCache>
+                <c:ptCount val="5"/>
+                <c:pt idx="0">
+                  <c:v>2021</c:v>
+                </c:pt>
+                <c:pt idx="1">
+                  <c:v>2022</c:v>
+                </c:pt>
+                <c:pt idx="2">
+                  <c:v>2023</c:v>
+                </c:pt>
+                <c:pt idx="3">
+                  <c:v>2024</c:v>
+                </c:pt>
+                <c:pt idx="4">
+                  <c:v>2025</c:v>
+                </c:pt>
+              </c:strCache>
+            </c:strRef>
+          </c:cat>
+          <c:val>
+            <c:numRef>
+              <c:f>Sheet1!$B$2:$B$6</c:f>
+              <c:numCache>
+                <c:formatCode>General</c:formatCode>
+                <c:ptCount val="5"/>
+                <c:pt idx="0">
+                  <c:v>3.8</c:v>
+                </c:pt>
+                <c:pt idx="1">
+                  <c:v>2.8</c:v>
+                </c:pt>
+                <c:pt idx="2">
+                  <c:v>2.2</c:v>
+                </c:pt>
+                <c:pt idx="3">
+                  <c:v>2.8</c:v>
+                </c:pt>
+                <c:pt idx="4">
+                  <c:v>2.5</c:v>
+                </c:pt>
+              </c:numCache>
+            </c:numRef>
+          </c:val>
+        </c:ser>
+        <c:ser>
+          <c:idx val="1"/>
+          <c:order val="1"/>
+          <c:tx>
+            <c:strRef>
+              <c:f>Sheet1!$C$1</c:f>
+              <c:strCache>
+                <c:ptCount val="1"/>
+                <c:pt idx="0">
+                  <c:v>SQB: MHXS 9 bo‘yicha 3-bosqich</c:v>
+                </c:pt>
+              </c:strCache>
+            </c:strRef>
+          </c:tx>
+          <c:spPr>
+            <a:solidFill>
+              <a:srgbClr val="1F4E79"/>
+            </a:solidFill>
+            <a:ln w="6350">
+              <a:solidFill>
+                <a:srgbClr val="FFFFFF"/>
+              </a:solidFill>
+            </a:ln>
+          </c:spPr>
+          <c:invertIfNegative val="0"/>
+          <c:dLbls>
+            <c:numFmt formatCode="0.0" sourceLinked="0"/>
+            <c:spPr>
+              <a:noFill/>
+              <a:ln>
+                <a:noFill/>
+              </a:ln>
+            </c:spPr>
+            <c:txPr>
+              <a:bodyPr/>
+              <a:lstStyle/>
+              <a:p>
+                <a:pPr>
+                  <a:defRPr sz="1050" b="1">
+                    <a:solidFill>
+                      <a:srgbClr val="000000"/>
+                    </a:solidFill>
+                    <a:latin typeface="Times New Roman"/>
+                    <a:cs typeface="Times New Roman"/>
+                  </a:defRPr>
+                </a:pPr>
+                <a:endParaRPr lang="uz-Latn-UZ"/>
+              </a:p>
+            </c:txPr>
+            <c:dLblPos val="outEnd"/>
+            <c:showLegendKey val="0"/>
+            <c:showVal val="1"/>
+            <c:showCatName val="0"/>
+            <c:showSerName val="0"/>
+            <c:showPercent val="0"/>
+            <c:showBubbleSize val="0"/>
+          </c:dLbls>
+          <c:cat>
+            <c:strRef>
+              <c:f>Sheet1!$A$2:$A$6</c:f>
+              <c:strCache>
+                <c:ptCount val="5"/>
+                <c:pt idx="0">
+                  <c:v>2021</c:v>
+                </c:pt>
+                <c:pt idx="1">
+                  <c:v>2022</c:v>
+                </c:pt>
+                <c:pt idx="2">
+                  <c:v>2023</c:v>
+                </c:pt>
+                <c:pt idx="3">
+                  <c:v>2024</c:v>
+                </c:pt>
+                <c:pt idx="4">
+                  <c:v>2025</c:v>
+                </c:pt>
+              </c:strCache>
+            </c:strRef>
+          </c:cat>
+          <c:val>
+            <c:numRef>
+              <c:f>Sheet1!$C$2:$C$6</c:f>
+              <c:numCache>
+                <c:formatCode>General</c:formatCode>
+                <c:ptCount val="5"/>
+                <c:pt idx="0">
+                  <c:v>6.2</c:v>
+                </c:pt>
+                <c:pt idx="1">
+                  <c:v>7.4</c:v>
+                </c:pt>
+                <c:pt idx="2">
+                  <c:v>4.8</c:v>
+                </c:pt>
+                <c:pt idx="3">
+                  <c:v>5.9</c:v>
+                </c:pt>
+                <c:pt idx="4">
+                  <c:v>7.5</c:v>
+                </c:pt>
+              </c:numCache>
+            </c:numRef>
+          </c:val>
+        </c:ser>
+        <c:ser>
+          <c:idx val="2"/>
+          <c:order val="2"/>
+          <c:tx>
+            <c:strRef>
+              <c:f>Sheet1!$D$1</c:f>
+              <c:strCache>
+                <c:ptCount val="1"/>
+                <c:pt idx="0">
+                  <c:v>MKB: rasmiy muammoli kreditlar</c:v>
+                </c:pt>
+              </c:strCache>
+            </c:strRef>
+          </c:tx>
+          <c:spPr>
+            <a:solidFill>
+              <a:srgbClr val="A9D18E"/>
+            </a:solidFill>
+            <a:ln w="6350">
+              <a:solidFill>
+                <a:srgbClr val="FFFFFF"/>
+              </a:solidFill>
+            </a:ln>
+          </c:spPr>
+          <c:invertIfNegative val="0"/>
+          <c:dLbls>
+            <c:numFmt formatCode="0.0" sourceLinked="0"/>
+            <c:spPr>
+              <a:noFill/>
+              <a:ln>
+                <a:noFill/>
+              </a:ln>
+            </c:spPr>
+            <c:txPr>
+              <a:bodyPr/>
+              <a:lstStyle/>
+              <a:p>
+                <a:pPr>
+                  <a:defRPr sz="1050" b="1">
+                    <a:solidFill>
+                      <a:srgbClr val="000000"/>
+                    </a:solidFill>
+                    <a:latin typeface="Times New Roman"/>
+                    <a:cs typeface="Times New Roman"/>
+                  </a:defRPr>
+                </a:pPr>
+                <a:endParaRPr lang="uz-Latn-UZ"/>
+              </a:p>
+            </c:txPr>
+            <c:dLblPos val="outEnd"/>
+            <c:showLegendKey val="0"/>
+            <c:showVal val="1"/>
+            <c:showCatName val="0"/>
+            <c:showSerName val="0"/>
+            <c:showPercent val="0"/>
+            <c:showBubbleSize val="0"/>
+          </c:dLbls>
+          <c:cat>
+            <c:strRef>
+              <c:f>Sheet1!$A$2:$A$6</c:f>
+              <c:strCache>
+                <c:ptCount val="5"/>
+                <c:pt idx="0">
+                  <c:v>2021</c:v>
+                </c:pt>
+                <c:pt idx="1">
+                  <c:v>2022</c:v>
+                </c:pt>
+                <c:pt idx="2">
+                  <c:v>2023</c:v>
+                </c:pt>
+                <c:pt idx="3">
+                  <c:v>2024</c:v>
+                </c:pt>
+                <c:pt idx="4">
+                  <c:v>2025</c:v>
+                </c:pt>
+              </c:strCache>
+            </c:strRef>
+          </c:cat>
+          <c:val>
+            <c:numRef>
+              <c:f>Sheet1!$D$2:$D$6</c:f>
+              <c:numCache>
+                <c:formatCode>General</c:formatCode>
+                <c:ptCount val="5"/>
+                <c:pt idx="0">
+                  <c:v>5.9</c:v>
+                </c:pt>
+                <c:pt idx="1">
+                  <c:v>4.8</c:v>
+                </c:pt>
+                <c:pt idx="2">
+                  <c:v>6.0</c:v>
+                </c:pt>
+                <c:pt idx="3">
+                  <c:v>4.6</c:v>
+                </c:pt>
+                <c:pt idx="4">
+                  <c:v>4.4</c:v>
+                </c:pt>
+              </c:numCache>
+            </c:numRef>
+          </c:val>
+        </c:ser>
+        <c:ser>
+          <c:idx val="3"/>
+          <c:order val="3"/>
+          <c:tx>
+            <c:strRef>
+              <c:f>Sheet1!$E$1</c:f>
+              <c:strCache>
+                <c:ptCount val="1"/>
+                <c:pt idx="0">
+                  <c:v>MKB: MHXS 9 bo‘yicha 3-bosqich</c:v>
+                </c:pt>
+              </c:strCache>
+            </c:strRef>
+          </c:tx>
+          <c:spPr>
+            <a:solidFill>
+              <a:srgbClr val="38761D"/>
+            </a:solidFill>
+            <a:ln w="6350">
+              <a:solidFill>
+                <a:srgbClr val="FFFFFF"/>
+              </a:solidFill>
+            </a:ln>
+          </c:spPr>
+          <c:invertIfNegative val="0"/>
+          <c:dLbls>
+            <c:numFmt formatCode="0.0" sourceLinked="0"/>
+            <c:spPr>
+              <a:noFill/>
+              <a:ln>
+                <a:noFill/>
+              </a:ln>
+            </c:spPr>
+            <c:txPr>
+              <a:bodyPr/>
+              <a:lstStyle/>
+              <a:p>
+                <a:pPr>
+                  <a:defRPr sz="1050" b="1">
+                    <a:solidFill>
+                      <a:srgbClr val="000000"/>
+                    </a:solidFill>
+                    <a:latin typeface="Times New Roman"/>
+                    <a:cs typeface="Times New Roman"/>
+                  </a:defRPr>
+                </a:pPr>
+                <a:endParaRPr lang="uz-Latn-UZ"/>
+              </a:p>
+            </c:txPr>
+            <c:dLblPos val="outEnd"/>
+            <c:showLegendKey val="0"/>
+            <c:showVal val="1"/>
+            <c:showCatName val="0"/>
+            <c:showSerName val="0"/>
+            <c:showPercent val="0"/>
+            <c:showBubbleSize val="0"/>
+          </c:dLbls>
+          <c:cat>
+            <c:strRef>
+              <c:f>Sheet1!$A$2:$A$6</c:f>
+              <c:strCache>
+                <c:ptCount val="5"/>
+                <c:pt idx="0">
+                  <c:v>2021</c:v>
+                </c:pt>
+                <c:pt idx="1">
+                  <c:v>2022</c:v>
+                </c:pt>
+                <c:pt idx="2">
+                  <c:v>2023</c:v>
+                </c:pt>
+                <c:pt idx="3">
+                  <c:v>2024</c:v>
+                </c:pt>
+                <c:pt idx="4">
+                  <c:v>2025</c:v>
+                </c:pt>
+              </c:strCache>
+            </c:strRef>
+          </c:cat>
+          <c:val>
+            <c:numRef>
+              <c:f>Sheet1!$E$2:$E$6</c:f>
+              <c:numCache>
+                <c:formatCode>General</c:formatCode>
+                <c:ptCount val="5"/>
+                <c:pt idx="0">
+                  <c:v>17.4</c:v>
+                </c:pt>
+                <c:pt idx="1">
+                  <c:v>13.5</c:v>
+                </c:pt>
+                <c:pt idx="2">
+                  <c:v>16.6</c:v>
+                </c:pt>
+                <c:pt idx="3">
+                  <c:v>15.2</c:v>
+                </c:pt>
+                <c:pt idx="4">
+                  <c:v>12.3</c:v>
+                </c:pt>
+              </c:numCache>
+            </c:numRef>
+          </c:val>
+        </c:ser>
+        <c:gapWidth val="50"/>
+        <c:axId val="111"/>
+        <c:axId val="222"/>
+      </c:barChart>
+      <c:catAx>
+        <c:axId val="111"/>
+        <c:scaling>
+          <c:orientation val="minMax"/>
+        </c:scaling>
+        <c:delete val="0"/>
+        <c:axPos val="b"/>
+        <c:numFmt formatCode="General" sourceLinked="0"/>
+        <c:majorTickMark val="none"/>
+        <c:minorTickMark val="none"/>
+        <c:tickLblPos val="low"/>
+        <c:spPr>
+          <a:ln w="9525">
+            <a:solidFill>
+              <a:srgbClr val="595959"/>
+            </a:solidFill>
+          </a:ln>
+        </c:spPr>
+        <c:txPr>
+          <a:bodyPr rot="0" vert="horz"/>
+          <a:lstStyle/>
+          <a:p>
+            <a:pPr>
+              <a:defRPr sz="1100" b="0">
+                <a:solidFill>
+                  <a:srgbClr val="000000"/>
+                </a:solidFill>
+                <a:latin typeface="Times New Roman"/>
+                <a:cs typeface="Times New Roman"/>
+              </a:defRPr>
+            </a:pPr>
+            <a:endParaRPr lang="uz-Latn-UZ"/>
+          </a:p>
+        </c:txPr>
+        <c:crossAx val="222"/>
+        <c:crosses val="autoZero"/>
+        <c:auto val="1"/>
+        <c:lblAlgn val="ctr"/>
+        <c:lblOffset val="100"/>
+        <c:tickLblSkip val="1"/>
+        <c:noMultiLvlLbl val="0"/>
+      </c:catAx>
+      <c:valAx>
+        <c:axId val="222"/>
+        <c:scaling>
+          <c:orientation val="minMax"/>
+          <c:max val="20"/>
+          <c:min val="0"/>
+        </c:scaling>
+        <c:delete val="0"/>
+        <c:axPos val="l"/>
+        <c:majorGridlines>
+          <c:spPr>
+            <a:ln w="6350">
+              <a:solidFill>
+                <a:srgbClr val="D9D9D9"/>
+              </a:solidFill>
+            </a:ln>
+          </c:spPr>
+        </c:majorGridlines>
+        <c:title>
+          <c:tx>
+            <c:rich>
+              <a:bodyPr rot="-5400000" vert="horz"/>
+              <a:lstStyle/>
+              <a:p>
+                <a:pPr>
+                  <a:defRPr sz="1100" b="0">
+                    <a:solidFill>
+                      <a:srgbClr val="000000"/>
+                    </a:solidFill>
+                    <a:latin typeface="Times New Roman"/>
+                    <a:cs typeface="Times New Roman"/>
+                  </a:defRPr>
+                </a:pPr>
+                <a:r>
+                  <a:rPr lang="uz-Latn-UZ" sz="1100" b="0">
+                    <a:solidFill>
+                      <a:srgbClr val="000000"/>
+                    </a:solidFill>
+                    <a:latin typeface="Times New Roman"/>
+                  </a:rPr>
+                  <a:t>Jami kreditlarga nisbatan, %</a:t>
+                </a:r>
+              </a:p>
+            </c:rich>
+          </c:tx>
+          <c:overlay val="0"/>
+        </c:title>
+        <c:numFmt formatCode="General" sourceLinked="0"/>
+        <c:majorTickMark val="out"/>
+        <c:minorTickMark val="none"/>
+        <c:tickLblPos val="low"/>
+        <c:spPr>
+          <a:ln w="9525">
+            <a:solidFill>
+              <a:srgbClr val="595959"/>
+            </a:solidFill>
+          </a:ln>
+        </c:spPr>
+        <c:txPr>
+          <a:bodyPr/>
+          <a:lstStyle/>
+          <a:p>
+            <a:pPr>
+              <a:defRPr sz="1100" b="0">
+                <a:solidFill>
+                  <a:srgbClr val="000000"/>
+                </a:solidFill>
+                <a:latin typeface="Times New Roman"/>
+                <a:cs typeface="Times New Roman"/>
+              </a:defRPr>
+            </a:pPr>
+            <a:endParaRPr lang="uz-Latn-UZ"/>
+          </a:p>
+        </c:txPr>
+        <c:crossAx val="111"/>
+        <c:crosses val="autoZero"/>
+        <c:crossBetween val="between"/>
+        <c:majorUnit val="4"/>
+      </c:valAx>
+      <c:spPr>
+        <a:noFill/>
+        <a:ln>
+          <a:noFill/>
+        </a:ln>
+      </c:spPr>
+    </c:plotArea>
+    <c:legend>
+      <c:legendPos val="b"/>
+      <c:overlay val="0"/>
+      <c:txPr>
+        <a:bodyPr/>
+        <a:lstStyle/>
+        <a:p>
+          <a:pPr>
+            <a:defRPr sz="1050" b="0">
+              <a:solidFill>
+                <a:srgbClr val="000000"/>
+              </a:solidFill>
+              <a:latin typeface="Times New Roman"/>
+              <a:cs typeface="Times New Roman"/>
+            </a:defRPr>
+          </a:pPr>
+          <a:endParaRPr lang="uz-Latn-UZ"/>
+        </a:p>
+      </c:txPr>
+    </c:legend>
+    <c:plotVisOnly val="1"/>
+    <c:dispBlanksAs val="gap"/>
+  </c:chart>
+  <c:spPr>
+    <a:solidFill>
+      <a:srgbClr val="FFFFFF"/>
+    </a:solidFill>
+    <a:ln>
+      <a:noFill/>
+    </a:ln>
+  </c:spPr>
+  <c:txPr>
+    <a:bodyPr/>
+    <a:lstStyle/>
+    <a:p>
+      <a:pPr>
+        <a:defRPr sz="1100" b="0">
+          <a:solidFill>
+            <a:srgbClr val="000000"/>
+          </a:solidFill>
+          <a:latin typeface="Times New Roman"/>
+          <a:cs typeface="Times New Roman"/>
+        </a:defRPr>
+      </a:pPr>
+      <a:endParaRPr lang="uz-Latn-UZ"/>
+    </a:p>
+  </c:txPr>
+  <c:externalData r:id="rId1">
+    <c:autoUpdate val="0"/>
+  </c:externalData>
+</c:chartSpace>
+</file>
+
 <file path=word/theme/theme1.xml><?xml version="1.0" encoding="utf-8"?>
 <a:theme xmlns:a="http://schemas.openxmlformats.org/drawingml/2006/main" name="Office Theme">
   <a:themeElements>

</xml_diff>

<commit_message>
2.2-§: 2021-yil MHXS ko‘rsatkichlari banklarning 2021-yilgi hisobotlari bo‘yicha, 2020-yil taqqoslash uchun qo‘shildi
Co-Authored-By: Claude Opus 5.5 <noreply@anthropic.com>
Claude-Session: https://claude.ai/code/session_01PxHTC8Q7yHdrpAeUA5KUgM
</commit_message>
<xml_diff>
--- a/paragraflar/2.2-paragraf.docx
+++ b/paragraflar/2.2-paragraf.docx
@@ -2,7 +2,7 @@
 <file path=word/document.xml><?xml version="1.0" encoding="utf-8"?>
 <w:document xmlns:w="http://schemas.openxmlformats.org/wordprocessingml/2006/main" xmlns:m="http://schemas.openxmlformats.org/officeDocument/2006/math" xmlns:r="http://schemas.openxmlformats.org/officeDocument/2006/relationships" xmlns:o="urn:schemas-microsoft-com:office:office" xmlns:v="urn:schemas-microsoft-com:vml" xmlns:w10="urn:schemas-microsoft-com:office:word" xmlns:a="http://schemas.openxmlformats.org/drawingml/2006/main" xmlns:pic="http://schemas.openxmlformats.org/drawingml/2006/picture" xmlns:wp="http://schemas.openxmlformats.org/drawingml/2006/wordprocessingDrawing">
   <w:body>
-    <w:bookmarkStart w:id="65" w:name="X637944ed30af1a5c7e12bfca1a7866b67ed51e5"/>
+    <w:bookmarkStart w:id="67" w:name="X637944ed30af1a5c7e12bfca1a7866b67ed51e5"/>
     <w:p>
       <w:pPr>
         <w:pStyle w:val="Heading2"/>
@@ -6649,6 +6649,12 @@
       </w:r>
       <w:r>
         <w:rPr>
+          <w:rStyle w:val="FootnoteReference"/>
+        </w:rPr>
+        <w:footnoteReference w:id="59"/>
+      </w:r>
+      <w:r>
+        <w:rPr>
           <w:rFonts w:ascii="Times New Roman" w:hAnsi="Times New Roman" w:cs="Times New Roman" w:eastAsia="Times New Roman"/>
           <w:sz w:val="28"/>
         </w:rPr>
@@ -6658,7 +6664,7 @@
         <w:rPr>
           <w:rStyle w:val="FootnoteReference"/>
         </w:rPr>
-        <w:footnoteReference w:id="59"/>
+        <w:footnoteReference w:id="60"/>
       </w:r>
       <w:r>
         <w:rPr>
@@ -6671,14 +6677,27 @@
         <w:rPr>
           <w:rStyle w:val="FootnoteReference"/>
         </w:rPr>
-        <w:footnoteReference w:id="60"/>
+        <w:footnoteReference w:id="61"/>
       </w:r>
       <w:r>
         <w:rPr>
           <w:rFonts w:ascii="Times New Roman" w:hAnsi="Times New Roman" w:cs="Times New Roman" w:eastAsia="Times New Roman"/>
           <w:sz w:val="28"/>
         </w:rPr>
-        <w:t xml:space="preserve">. Demak, milliy hisobot ma’lumotlari asosida hisoblangan muammoli kreditlar ko‘rsatkichi har ikki bankda ham kredit riskini muntazam ravishda kamsitib ko‘rsatadi, bu farq esa davlat ulushi yuqori va imtiyozli kreditlash ko‘p bo‘lgan bankda ayniqsa katta.</w:t>
+        <w:t xml:space="preserve">. Taqqoslash uchun, 2020-yil oxirida bu bankda 3-bosqich kreditlari ulushi atigi 2,4 foizni, 2-bosqich kreditlari ulushi esa 5,1 foizni tashkil etgan, «O‘zsanoatqurilishbank» ATB da esa mos ravishda 6,6 va 29,3 foiz bo‘lgan</w:t>
+      </w:r>
+      <w:r>
+        <w:rPr>
+          <w:rStyle w:val="FootnoteReference"/>
+        </w:rPr>
+        <w:footnoteReference w:id="62"/>
+      </w:r>
+      <w:r>
+        <w:rPr>
+          <w:rFonts w:ascii="Times New Roman" w:hAnsi="Times New Roman" w:cs="Times New Roman" w:eastAsia="Times New Roman"/>
+          <w:sz w:val="28"/>
+        </w:rPr>
+        <w:t xml:space="preserve">. Demak, «Mikrokreditbank» ATB da qadrsizlangan kreditlarning keskin ko‘payishi pandemiya davrida berilgan to‘lov muddatini kechiktirish imtiyozlari tugagan 2021-yilga to‘g‘ri kelgan va keyingi yillarda ham to‘liq bartaraf etilmagan. Demak, milliy hisobot ma’lumotlari asosida hisoblangan muammoli kreditlar ko‘rsatkichi har ikki bankda ham kredit riskini muntazam ravishda kamsitib ko‘rsatadi, bu farq esa davlat ulushi yuqori va imtiyozli kreditlash ko‘p bo‘lgan bankda ayniqsa katta.</w:t>
       </w:r>
     </w:p>
     <w:p>
@@ -6742,7 +6761,7 @@
         <w:rPr>
           <w:rStyle w:val="FootnoteReference"/>
         </w:rPr>
-        <w:footnoteReference w:id="61"/>
+        <w:footnoteReference w:id="63"/>
       </w:r>
     </w:p>
     <w:p>
@@ -6763,7 +6782,7 @@
         <w:rPr>
           <w:rStyle w:val="FootnoteReference"/>
         </w:rPr>
-        <w:footnoteReference w:id="62"/>
+        <w:footnoteReference w:id="64"/>
       </w:r>
       <w:r>
         <w:rPr>
@@ -6791,7 +6810,7 @@
         <w:rPr>
           <w:rStyle w:val="FootnoteReference"/>
         </w:rPr>
-        <w:footnoteReference w:id="63"/>
+        <w:footnoteReference w:id="65"/>
       </w:r>
       <w:r>
         <w:rPr>
@@ -6854,7 +6873,7 @@
         <w:rPr>
           <w:rStyle w:val="FootnoteReference"/>
         </w:rPr>
-        <w:footnoteReference w:id="64"/>
+        <w:footnoteReference w:id="66"/>
       </w:r>
     </w:p>
     <w:tbl>
@@ -8176,7 +8195,7 @@
         <w:t xml:space="preserve">O‘zbekiston bank tizimi va alohida banklar moliyaviy barqarorlik ko‘rsatkichlarini tadqiq etgan holda xulosa qilish mumkinki, 2021–2025-yillarda bank tizimi jadal o‘sib, davlat banklarining aktivlardagi ulushi 81,5 foizdan 63,5 foizgacha kamaydi, ammo ular tizimda ustunligicha qolmoqda. Rasmiy ko‘rsatkichlar bo‘yicha kapital va likvidlik Bazel III talablaridan ancha yuqori, biroq aktivlar sifati eng zaif bo‘g‘in bo‘lib qolmoqda: substandart kreditlar ulushi «O‘zsanoatqurilishbank» ATB da uch barobar oshgan, MHXS bo‘yicha qadrsizlangan kreditlar rasmiy ko‘rsatkichdan ikki-uch barobar yuqori. Ijtimoiy yo‘naltirilgan kreditlash bilan shug‘ullanuvchi «Mikrokreditbank» ATB misolida esa past daromadlilik, 2024-yilda yashirin kredit riskining bir yo‘la tan olinishi natijasidagi katta zarar va kapital yetarliligining davlat qayta kapitallashtirishiga bog‘liqligi aniqlandi. Bu o‘z navbatida, ko‘rsatkichlarning turli yo‘nalishdagi signallarini yagona bahoga keltiradigan, aktivlar sifatini MHXS 9 bo‘yicha hisobga oladigan va bankning davlat ko‘magisiz barqarorligini alohida baholaydigan integral metodikani ishlab chiqish zaruriyatini yuzaga keltiradi. Bunday metodika dissertatsiyaning uchinchi bobida taklif etiladi.</w:t>
       </w:r>
     </w:p>
-    <w:bookmarkEnd w:id="65"/>
+    <w:bookmarkEnd w:id="67"/>
     <w:sectPr>
       <w:pgMar w:left="1701" w:right="850" w:top="1134" w:bottom="1134"/>
     </w:sectPr>
@@ -8922,7 +8941,7 @@
         <w:t xml:space="preserve"> </w:t>
       </w:r>
       <w:r>
-        <w:t xml:space="preserve">Tadqiqot natijasida muallif tomonidan quyidagi manbalar ma’lumotlari asosida ishlab chiqildi: «O‘zsanoatqurilishbank» ATB ning Markaziy bankka taqdim etilgan prudensial hisobot shakllari (crs003C, crs003L, crs003O): bank balansi, daromadlar, regulyativ kapital hisob-kitobi, aktivlarni tasniflash va prudensial me’yorlar jadvallari, 2021–2025-yillar 30-dekabr holatiga; «Mikrokreditbank» ATB ning Markaziy bankka taqdim etilgan prudensial hisobot shakllari (crs005C, crs005L, crs005O): bank balansi, daromadlar, regulyativ kapital hisob-kitobi, aktivlarni tasniflash va prudensial me’yorlar jadvallari, 2021–2025-yillar 30-dekabr holatiga; Акционерный коммерческий банк «Узбекский промышленно-строительный банк» и его дочерние организации. Консолидированная финансовая отчетность и аудиторское заключение за годы, закончившиеся 31 декабря 2023, 2022 и 2021 гг. – Ташкент, 2024. – С. 40; Joint Stock Commercial Bank «Uzbek Industrial and Construction Bank» and its subsidiaries. Consolidated Financial Statements for the year ended 31 December 2025 and Independent Auditor’s Report. – Tashkent, 2026. – P. 28–31; Акционерно-коммерческий банк «Микрокредитбанк». Консолидированная финансовая отчетность за год, закончившийся 31 декабря 2024 года, и заключение независимых аудиторов. – Ташкент, 2025. – С. 49–51; Акционерно-коммерческий банк «Микрокредитбанк». Финансовая отчетность за год, закончившийся 31 декабря 2022 года, и заключение независимых аудиторов. – Ташкент, 2023. – С. 42–43; Акционерно-коммерческий банк «Микрокредитбанк». Консолидированная финансовая отчетность за год, закончившийся 31 декабря 2025 года, и заключение независимых аудиторов. – Ташкент, 2026. – С. 48. – https://mkbank.uz/uz/shareholders/financial-indicators/audit-report.</w:t>
+        <w:t xml:space="preserve">Tadqiqot natijasida muallif tomonidan quyidagi manbalar ma’lumotlari asosida ishlab chiqildi: «O‘zsanoatqurilishbank» ATB ning Markaziy bankka taqdim etilgan prudensial hisobot shakllari (crs003C, crs003L, crs003O): bank balansi, daromadlar, regulyativ kapital hisob-kitobi, aktivlarni tasniflash va prudensial me’yorlar jadvallari, 2021–2025-yillar 30-dekabr holatiga; «Mikrokreditbank» ATB ning Markaziy bankka taqdim etilgan prudensial hisobot shakllari (crs005C, crs005L, crs005O): bank balansi, daromadlar, regulyativ kapital hisob-kitobi, aktivlarni tasniflash va prudensial me’yorlar jadvallari, 2021–2025-yillar 30-dekabr holatiga; Акционерный коммерческий банк «Узбекский промышленно-строительный банк» и его дочерние организации. Консолидированная финансовая отчетность за год, закончившийся 31 декабря 2021 года, и аудиторское заключение. – Ташкент, 2022. – С. 46; Акционерный коммерческий банк «Узбекский промышленно-строительный банк» и его дочерние организации. Консолидированная финансовая отчетность и аудиторское заключение за годы, закончившиеся 31 декабря 2023, 2022 и 2021 гг. – Ташкент, 2024. – С. 40; Joint Stock Commercial Bank «Uzbek Industrial and Construction Bank» and its subsidiaries. Consolidated Financial Statements for the year ended 31 December 2025 and Independent Auditor’s Report. – Tashkent, 2026. – P. 28–31; Акционерно-коммерческий банк «Микрокредитбанк». Финансовая отчетность за год, закончившийся 31 декабря 2021 года, и заключение независимых аудиторов. – Ташкент, 2022. – С. 42–43; Акционерно-коммерческий банк «Микрокредитбанк». Консолидированная финансовая отчетность за год, закончившийся 31 декабря 2024 года, и заключение независимых аудиторов. – Ташкент, 2025. – С. 49–51; Акционерно-коммерческий банк «Микрокредитбанк». Финансовая отчетность за год, закончившийся 31 декабря 2022 года, и заключение независимых аудиторов. – Ташкент, 2023. – С. 42–43; Акционерно-коммерческий банк «Микрокредитбанк». Консолидированная финансовая отчетность за год, закончившийся 31 декабря 2025 года, и заключение независимых аудиторов. – Ташкент, 2026. – С. 48. – https://mkbank.uz/uz/shareholders/financial-indicators/audit-report.</w:t>
       </w:r>
     </w:p>
   </w:footnote>
@@ -8941,7 +8960,7 @@
         <w:t xml:space="preserve"> </w:t>
       </w:r>
       <w:r>
-        <w:t xml:space="preserve">Акционерный коммерческий банк «Узбекский промышленно-строительный банк» и его дочерние организации. Консолидированная финансовая отчетность и аудиторское заключение за годы, закончившиеся 31 декабря 2023, 2022 и 2021 гг. – Ташкент, 2024. – С. 40.</w:t>
+        <w:t xml:space="preserve">Акционерный коммерческий банк «Узбекский промышленно-строительный банк» и его дочерние организации. Консолидированная финансовая отчетность за год, закончившийся 31 декабря 2021 года, и аудиторское заключение. – Ташкент, 2022. – С. 46.</w:t>
       </w:r>
     </w:p>
   </w:footnote>
@@ -8960,7 +8979,7 @@
         <w:t xml:space="preserve"> </w:t>
       </w:r>
       <w:r>
-        <w:t xml:space="preserve">Joint Stock Commercial Bank «Uzbek Industrial and Construction Bank» and its subsidiaries. Consolidated Financial Statements for the year ended 31 December 2025 and Independent Auditor’s Report. – Tashkent, 2026. – P. 28–31.</w:t>
+        <w:t xml:space="preserve">Акционерный коммерческий банк «Узбекский промышленно-строительный банк» и его дочерние организации. Консолидированная финансовая отчетность и аудиторское заключение за годы, закончившиеся 31 декабря 2023, 2022 и 2021 гг. – Ташкент, 2024. – С. 40.</w:t>
       </w:r>
     </w:p>
   </w:footnote>
@@ -8979,7 +8998,7 @@
         <w:t xml:space="preserve"> </w:t>
       </w:r>
       <w:r>
-        <w:t xml:space="preserve">Акционерно-коммерческий банк «Микрокредитбанк». Консолидированная финансовая отчетность за год, закончившийся 31 декабря 2024 года, и заключение независимых аудиторов. – Ташкент, 2025. – С. 49–51; Акционерно-коммерческий банк «Микрокредитбанк». Финансовая отчетность за год, закончившийся 31 декабря 2022 года, и заключение независимых аудиторов. – Ташкент, 2023. – С. 42–43; Акционерно-коммерческий банк «Микрокредитбанк». Консолидированная финансовая отчетность за год, закончившийся 31 декабря 2025 года, и заключение независимых аудиторов. – Ташкент, 2026. – С. 48. – https://mkbank.uz/uz/shareholders/financial-indicators/audit-report/</w:t>
+        <w:t xml:space="preserve">Joint Stock Commercial Bank «Uzbek Industrial and Construction Bank» and its subsidiaries. Consolidated Financial Statements for the year ended 31 December 2025 and Independent Auditor’s Report. – Tashkent, 2026. – P. 28–31.</w:t>
       </w:r>
     </w:p>
   </w:footnote>
@@ -8998,7 +9017,7 @@
         <w:t xml:space="preserve"> </w:t>
       </w:r>
       <w:r>
-        <w:t xml:space="preserve">Tadqiqot natijasida muallif tomonidan quyidagi manbalar ma’lumotlari asosida ishlab chiqildi: «O‘zsanoatqurilishbank» ATB ning Markaziy bankka taqdim etilgan prudensial hisobot shakllari (crs003C, crs003L, crs003O): bank balansi, daromadlar, regulyativ kapital hisob-kitobi, aktivlarni tasniflash va prudensial me’yorlar jadvallari, 2021–2025-yillar 30-dekabr holatiga; «Mikrokreditbank» ATB ning Markaziy bankka taqdim etilgan prudensial hisobot shakllari (crs005C, crs005L, crs005O): bank balansi, daromadlar, regulyativ kapital hisob-kitobi, aktivlarni tasniflash va prudensial me’yorlar jadvallari, 2021–2025-yillar 30-dekabr holatiga.</w:t>
+        <w:t xml:space="preserve">Акционерно-коммерческий банк «Микрокредитбанк». Финансовая отчетность за год, закончившийся 31 декабря 2021 года, и заключение независимых аудиторов. – Ташкент, 2022. – С. 42–43; Акционерно-коммерческий банк «Микрокредитбанк». Консолидированная финансовая отчетность за год, закончившийся 31 декабря 2024 года, и заключение независимых аудиторов. – Ташкент, 2025. – С. 49–51; Акционерно-коммерческий банк «Микрокредитбанк». Финансовая отчетность за год, закончившийся 31 декабря 2022 года, и заключение независимых аудиторов. – Ташкент, 2023. – С. 42–43; Акционерно-коммерческий банк «Микрокредитбанк». Консолидированная финансовая отчетность за год, закончившийся 31 декабря 2025 года, и заключение независимых аудиторов. – Ташкент, 2026. – С. 48. – https://mkbank.uz/uz/shareholders/financial-indicators/audit-report/</w:t>
       </w:r>
     </w:p>
   </w:footnote>
@@ -9017,7 +9036,7 @@
         <w:t xml:space="preserve"> </w:t>
       </w:r>
       <w:r>
-        <w:t xml:space="preserve">«Mikrokreditbank» ATB ning Markaziy bankka taqdim etilgan prudensial hisobot shakllari (crs005C, crs005L, crs005O): bank balansi, daromadlar, regulyativ kapital hisob-kitobi, aktivlarni tasniflash va prudensial me’yorlar jadvallari, 2021–2025-yillar 30-dekabr holatiga.</w:t>
+        <w:t xml:space="preserve">Акционерный коммерческий банк «Узбекский промышленно-строительный банк» и его дочерние организации. Консолидированная финансовая отчетность за год, закончившийся 31 декабря 2021 года, и аудиторское заключение. – Ташкент, 2022. – С. 46.</w:t>
       </w:r>
     </w:p>
   </w:footnote>
@@ -9036,7 +9055,7 @@
         <w:t xml:space="preserve"> </w:t>
       </w:r>
       <w:r>
-        <w:t xml:space="preserve">«O‘zsanoatqurilishbank» ATB ning Markaziy bankka taqdim etilgan prudensial hisobot shakllari (crs003C, crs003L, crs003O): bank balansi, daromadlar, regulyativ kapital hisob-kitobi, aktivlarni tasniflash va prudensial me’yorlar jadvallari, 2021–2025-yillar 30-dekabr holatiga.</w:t>
+        <w:t xml:space="preserve">Tadqiqot natijasida muallif tomonidan quyidagi manbalar ma’lumotlari asosida ishlab chiqildi: «O‘zsanoatqurilishbank» ATB ning Markaziy bankka taqdim etilgan prudensial hisobot shakllari (crs003C, crs003L, crs003O): bank balansi, daromadlar, regulyativ kapital hisob-kitobi, aktivlarni tasniflash va prudensial me’yorlar jadvallari, 2021–2025-yillar 30-dekabr holatiga; «Mikrokreditbank» ATB ning Markaziy bankka taqdim etilgan prudensial hisobot shakllari (crs005C, crs005L, crs005O): bank balansi, daromadlar, regulyativ kapital hisob-kitobi, aktivlarni tasniflash va prudensial me’yorlar jadvallari, 2021–2025-yillar 30-dekabr holatiga.</w:t>
       </w:r>
     </w:p>
   </w:footnote>
@@ -9055,7 +9074,45 @@
         <w:t xml:space="preserve"> </w:t>
       </w:r>
       <w:r>
-        <w:t xml:space="preserve">Tadqiqot natijasida muallif tomonidan quyidagi manbalar ma’lumotlari asosida ishlab chiqildi: O‘zbekiston Respublikasi Markaziy banki. Statistik byulleten: 2021-yil. – Toshkent, 2022. – 5.1.8b-jadval; O‘zbekiston Respublikasi Markaziy banki. Statistik byulleten: 2026-yil mart. – Toshkent, 2026. – 5.1.2, 5.1.3, 5.1.4, 5.1.6, 5.1.7, 5.1.8-jadvallar. – https://cbu.uz/uz/statistics/buleten; The Central Bank of the Republic of Uzbekistan. Financial Stability Report for 2025. – Tashkent, 2026; World Bank. Republic of Uzbekistan: Financial Sector Assessment. – Washington, DC: World Bank, 2025; «O‘zsanoatqurilishbank» ATB ning Markaziy bankka taqdim etilgan prudensial hisobot shakllari (crs003C, crs003L, crs003O): bank balansi, daromadlar, regulyativ kapital hisob-kitobi, aktivlarni tasniflash va prudensial me’yorlar jadvallari, 2021–2025-yillar 30-dekabr holatiga; «Mikrokreditbank» ATB ning Markaziy bankka taqdim etilgan prudensial hisobot shakllari (crs005C, crs005L, crs005O): bank balansi, daromadlar, regulyativ kapital hisob-kitobi, aktivlarni tasniflash va prudensial me’yorlar jadvallari, 2021–2025-yillar 30-dekabr holatiga; Joint Stock Commercial Bank «Uzbek Industrial and Construction Bank» and its subsidiaries. Consolidated Financial Statements for the year ended 31 December 2025 and Independent Auditor’s Report. – Tashkent, 2026. – P. 28–31; Акционерно-коммерческий банк «Микрокредитбанк». Консолидированная финансовая отчетность за год, закончившийся 31 декабря 2024 года, и заключение независимых аудиторов. – Ташкент, 2025. – С. 49–51; Акционерно-коммерческий банк «Микрокредитбанк». Финансовая отчетность за год, закончившийся 31 декабря 2022 года, и заключение независимых аудиторов. – Ташкент, 2023. – С. 42–43; Акционерно-коммерческий банк «Микрокредитбанк». Консолидированная финансовая отчетность за год, закончившийся 31 декабря 2025 года, и заключение независимых аудиторов. – Ташкент, 2026. – С. 48. – https://mkbank.uz/uz/shareholders/financial-indicators/audit-report.</w:t>
+        <w:t xml:space="preserve">«Mikrokreditbank» ATB ning Markaziy bankka taqdim etilgan prudensial hisobot shakllari (crs005C, crs005L, crs005O): bank balansi, daromadlar, regulyativ kapital hisob-kitobi, aktivlarni tasniflash va prudensial me’yorlar jadvallari, 2021–2025-yillar 30-dekabr holatiga.</w:t>
+      </w:r>
+    </w:p>
+  </w:footnote>
+  <w:footnote w:id="65">
+    <w:p>
+      <w:pPr>
+        <w:pStyle w:val="FootnoteText"/>
+      </w:pPr>
+      <w:r>
+        <w:rPr>
+          <w:rStyle w:val="FootnoteReference"/>
+        </w:rPr>
+        <w:footnoteRef/>
+      </w:r>
+      <w:r>
+        <w:t xml:space="preserve"> </w:t>
+      </w:r>
+      <w:r>
+        <w:t xml:space="preserve">«O‘zsanoatqurilishbank» ATB ning Markaziy bankka taqdim etilgan prudensial hisobot shakllari (crs003C, crs003L, crs003O): bank balansi, daromadlar, regulyativ kapital hisob-kitobi, aktivlarni tasniflash va prudensial me’yorlar jadvallari, 2021–2025-yillar 30-dekabr holatiga.</w:t>
+      </w:r>
+    </w:p>
+  </w:footnote>
+  <w:footnote w:id="66">
+    <w:p>
+      <w:pPr>
+        <w:pStyle w:val="FootnoteText"/>
+      </w:pPr>
+      <w:r>
+        <w:rPr>
+          <w:rStyle w:val="FootnoteReference"/>
+        </w:rPr>
+        <w:footnoteRef/>
+      </w:r>
+      <w:r>
+        <w:t xml:space="preserve"> </w:t>
+      </w:r>
+      <w:r>
+        <w:t xml:space="preserve">Tadqiqot natijasida muallif tomonidan quyidagi manbalar ma’lumotlari asosida ishlab chiqildi: O‘zbekiston Respublikasi Markaziy banki. Statistik byulleten: 2021-yil. – Toshkent, 2022. – 5.1.8b-jadval; O‘zbekiston Respublikasi Markaziy banki. Statistik byulleten: 2026-yil mart. – Toshkent, 2026. – 5.1.2, 5.1.3, 5.1.4, 5.1.6, 5.1.7, 5.1.8-jadvallar. – https://cbu.uz/uz/statistics/buleten; The Central Bank of the Republic of Uzbekistan. Financial Stability Report for 2025. – Tashkent, 2026; World Bank. Republic of Uzbekistan: Financial Sector Assessment. – Washington, DC: World Bank, 2025; «O‘zsanoatqurilishbank» ATB ning Markaziy bankka taqdim etilgan prudensial hisobot shakllari (crs003C, crs003L, crs003O): bank balansi, daromadlar, regulyativ kapital hisob-kitobi, aktivlarni tasniflash va prudensial me’yorlar jadvallari, 2021–2025-yillar 30-dekabr holatiga; «Mikrokreditbank» ATB ning Markaziy bankka taqdim etilgan prudensial hisobot shakllari (crs005C, crs005L, crs005O): bank balansi, daromadlar, regulyativ kapital hisob-kitobi, aktivlarni tasniflash va prudensial me’yorlar jadvallari, 2021–2025-yillar 30-dekabr holatiga; Joint Stock Commercial Bank «Uzbek Industrial and Construction Bank» and its subsidiaries. Consolidated Financial Statements for the year ended 31 December 2025 and Independent Auditor’s Report. – Tashkent, 2026. – P. 28–31; Акционерно-коммерческий банк «Микрокредитбанк». Финансовая отчетность за год, закончившийся 31 декабря 2021 года, и заключение независимых аудиторов. – Ташкент, 2022. – С. 42–43; Акционерно-коммерческий банк «Микрокредитбанк». Консолидированная финансовая отчетность за год, закончившийся 31 декабря 2024 года, и заключение независимых аудиторов. – Ташкент, 2025. – С. 49–51; Акционерно-коммерческий банк «Микрокредитбанк». Финансовая отчетность за год, закончившийся 31 декабря 2022 года, и заключение независимых аудиторов. – Ташкент, 2023. – С. 42–43; Акционерно-коммерческий банк «Микрокредитбанк». Консолидированная финансовая отчетность за год, закончившийся 31 декабря 2025 года, и заключение независимых аудиторов. – Ташкент, 2026. – С. 48. – https://mkbank.uz/uz/shareholders/financial-indicators/audit-report.</w:t>
       </w:r>
     </w:p>
   </w:footnote>

</xml_diff>

<commit_message>
2.2-§: banklar 2021-yil ROA/ROE 2020-yil oxiri ma’lumotlari bilan o‘rtacha qiymat bo‘yicha qayta hisoblandi
Co-Authored-By: Claude Opus 5.5 <noreply@anthropic.com>
Claude-Session: https://claude.ai/code/session_01PxHTC8Q7yHdrpAeUA5KUgM
</commit_message>
<xml_diff>
--- a/paragraflar/2.2-paragraf.docx
+++ b/paragraflar/2.2-paragraf.docx
@@ -4447,7 +4447,7 @@
                 <w:rFonts w:ascii="Times New Roman" w:hAnsi="Times New Roman" w:cs="Times New Roman" w:eastAsia="Times New Roman"/>
                 <w:sz w:val="22"/>
               </w:rPr>
-              <w:t xml:space="preserve">2,2</w:t>
+              <w:t xml:space="preserve">2,3</w:t>
             </w:r>
           </w:p>
         </w:tc>
@@ -4572,7 +4572,7 @@
                 <w:rFonts w:ascii="Times New Roman" w:hAnsi="Times New Roman" w:cs="Times New Roman" w:eastAsia="Times New Roman"/>
                 <w:sz w:val="22"/>
               </w:rPr>
-              <w:t xml:space="preserve">16,0</w:t>
+              <w:t xml:space="preserve">17,1</w:t>
             </w:r>
           </w:p>
         </w:tc>
@@ -5916,7 +5916,7 @@
                 <w:rFonts w:ascii="Times New Roman" w:hAnsi="Times New Roman" w:cs="Times New Roman" w:eastAsia="Times New Roman"/>
                 <w:sz w:val="22"/>
               </w:rPr>
-              <w:t xml:space="preserve">2,2</w:t>
+              <w:t xml:space="preserve">2,5</w:t>
             </w:r>
           </w:p>
         </w:tc>
@@ -6391,7 +6391,7 @@
           <w:i/>
           <w:sz w:val="28"/>
         </w:rPr>
-        <w:t xml:space="preserve">Izoh: muammoli kreditlar – qoniqarsiz, shubhali va umidsiz deb tasniflangan kreditlar; ROA va ROE sof foydaning aktivlar va kapitalning o‘rtacha yillik qiymatiga nisbati sifatida hisoblandi (2021-yil uchun yil oxiri qiymati olindi).</w:t>
+        <w:t xml:space="preserve">Izoh: muammoli kreditlar – qoniqarsiz, shubhali va umidsiz deb tasniflangan kreditlar; ROA va ROE sof foydaning aktivlar va kapitalning o‘rtacha yillik qiymatiga nisbati sifatida hisoblandi.</w:t>
       </w:r>
     </w:p>
     <w:p>
@@ -6776,7 +6776,7 @@
           <w:rFonts w:ascii="Times New Roman" w:hAnsi="Times New Roman" w:cs="Times New Roman" w:eastAsia="Times New Roman"/>
           <w:sz w:val="28"/>
         </w:rPr>
-        <w:t xml:space="preserve">Rasm ma’lumotlari shuni ko‘rsatadiki, «O‘zsanoatqurilishbank» ATB ning kapital rentabelligi 2022-yildagi pasayishdan keyin tiklanib, 2025-yilda 17,2 foizga yetgan, ya’ni tizim o‘rtacha darajasidan yuqori. «Mikrokreditbank» ATB da esa ROE 2021–2023-yillarda 0,7–2,2 foiz bilan inflyatsiya darajasidan ancha past bo‘lgan, 2024-yilda esa bank 1 703,8 mlrd so‘m zarar ko‘rgan. Bu zarar aktivlar bo‘yicha ehtimoliy yo‘qotishlarga qarshi zaxiralarning keskin oshirilishi natijasida yuzaga kelgan: zaxiralar ajratilgandan keyingi sof foizli daromad 1 167,3 mlrd so‘m zararni tashkil etgan</w:t>
+        <w:t xml:space="preserve">Rasm ma’lumotlari shuni ko‘rsatadiki, «O‘zsanoatqurilishbank» ATB ning kapital rentabelligi 2022-yildagi pasayishdan keyin tiklanib, 2025-yilda 17,2 foizga yetgan, ya’ni tizim o‘rtacha darajasidan yuqori. «Mikrokreditbank» ATB da esa ROE 2021–2023-yillarda 0,7–2,5 foiz bilan inflyatsiya darajasidan ancha past bo‘lgan, 2024-yilda esa bank 1 703,8 mlrd so‘m zarar ko‘rgan. Bu zarar aktivlar bo‘yicha ehtimoliy yo‘qotishlarga qarshi zaxiralarning keskin oshirilishi natijasida yuzaga kelgan: zaxiralar ajratilgandan keyingi sof foizli daromad 1 167,3 mlrd so‘m zararni tashkil etgan</w:t>
       </w:r>
       <w:r>
         <w:rPr>
@@ -8257,7 +8257,7 @@
         <w:t xml:space="preserve"> </w:t>
       </w:r>
       <w:r>
-        <w:t xml:space="preserve">«O‘zsanoatqurilishbank» ATB ning Markaziy bankka taqdim etilgan prudensial hisobot shakllari (crs003C, crs003L, crs003O): bank balansi, daromadlar, regulyativ kapital hisob-kitobi, aktivlarni tasniflash va prudensial me’yorlar jadvallari, 2021–2025-yillar 30-dekabr holatiga.</w:t>
+        <w:t xml:space="preserve">«O‘zsanoatqurilishbank» ATB ning Markaziy bankka taqdim etilgan prudensial hisobot shakllari (crs003C, crs003L, crs003O): bank balansi, daromadlar, regulyativ kapital hisob-kitobi, aktivlarni tasniflash va prudensial me’yorlar jadvallari, 2020–2025-yillar 30-dekabr holatiga.</w:t>
       </w:r>
     </w:p>
   </w:footnote>
@@ -8276,7 +8276,7 @@
         <w:t xml:space="preserve"> </w:t>
       </w:r>
       <w:r>
-        <w:t xml:space="preserve">«Mikrokreditbank» ATB ning Markaziy bankka taqdim etilgan prudensial hisobot shakllari (crs005C, crs005L, crs005O): bank balansi, daromadlar, regulyativ kapital hisob-kitobi, aktivlarni tasniflash va prudensial me’yorlar jadvallari, 2021–2025-yillar 30-dekabr holatiga.</w:t>
+        <w:t xml:space="preserve">«Mikrokreditbank» ATB ning Markaziy bankka taqdim etilgan prudensial hisobot shakllari (crs005C, crs005L, crs005O): bank balansi, daromadlar, regulyativ kapital hisob-kitobi, aktivlarni tasniflash va prudensial me’yorlar jadvallari, 2020–2025-yillar 30-dekabr holatiga.</w:t>
       </w:r>
     </w:p>
   </w:footnote>
@@ -8846,7 +8846,7 @@
         <w:t xml:space="preserve"> </w:t>
       </w:r>
       <w:r>
-        <w:t xml:space="preserve">Tadqiqot natijasida muallif tomonidan quyidagi manbalar ma’lumotlari asosida hisoblandi: «O‘zsanoatqurilishbank» ATB ning Markaziy bankka taqdim etilgan prudensial hisobot shakllari (crs003C, crs003L, crs003O): bank balansi, daromadlar, regulyativ kapital hisob-kitobi, aktivlarni tasniflash va prudensial me’yorlar jadvallari, 2021–2025-yillar 30-dekabr holatiga; «Mikrokreditbank» ATB ning Markaziy bankka taqdim etilgan prudensial hisobot shakllari (crs005C, crs005L, crs005O): bank balansi, daromadlar, regulyativ kapital hisob-kitobi, aktivlarni tasniflash va prudensial me’yorlar jadvallari, 2021–2025-yillar 30-dekabr holatiga.</w:t>
+        <w:t xml:space="preserve">Tadqiqot natijasida muallif tomonidan quyidagi manbalar ma’lumotlari asosida hisoblandi: «O‘zsanoatqurilishbank» ATB ning Markaziy bankka taqdim etilgan prudensial hisobot shakllari (crs003C, crs003L, crs003O): bank balansi, daromadlar, regulyativ kapital hisob-kitobi, aktivlarni tasniflash va prudensial me’yorlar jadvallari, 2020–2025-yillar 30-dekabr holatiga; «Mikrokreditbank» ATB ning Markaziy bankka taqdim etilgan prudensial hisobot shakllari (crs005C, crs005L, crs005O): bank balansi, daromadlar, regulyativ kapital hisob-kitobi, aktivlarni tasniflash va prudensial me’yorlar jadvallari, 2020–2025-yillar 30-dekabr holatiga.</w:t>
       </w:r>
     </w:p>
   </w:footnote>
@@ -8865,7 +8865,7 @@
         <w:t xml:space="preserve"> </w:t>
       </w:r>
       <w:r>
-        <w:t xml:space="preserve">Tadqiqot natijasida muallif tomonidan quyidagi manbalar ma’lumotlari asosida ishlab chiqildi: «O‘zsanoatqurilishbank» ATB ning Markaziy bankka taqdim etilgan prudensial hisobot shakllari (crs003C, crs003L, crs003O): bank balansi, daromadlar, regulyativ kapital hisob-kitobi, aktivlarni tasniflash va prudensial me’yorlar jadvallari, 2021–2025-yillar 30-dekabr holatiga; «Mikrokreditbank» ATB ning Markaziy bankka taqdim etilgan prudensial hisobot shakllari (crs005C, crs005L, crs005O): bank balansi, daromadlar, regulyativ kapital hisob-kitobi, aktivlarni tasniflash va prudensial me’yorlar jadvallari, 2021–2025-yillar 30-dekabr holatiga.</w:t>
+        <w:t xml:space="preserve">Tadqiqot natijasida muallif tomonidan quyidagi manbalar ma’lumotlari asosida ishlab chiqildi: «O‘zsanoatqurilishbank» ATB ning Markaziy bankka taqdim etilgan prudensial hisobot shakllari (crs003C, crs003L, crs003O): bank balansi, daromadlar, regulyativ kapital hisob-kitobi, aktivlarni tasniflash va prudensial me’yorlar jadvallari, 2020–2025-yillar 30-dekabr holatiga; «Mikrokreditbank» ATB ning Markaziy bankka taqdim etilgan prudensial hisobot shakllari (crs005C, crs005L, crs005O): bank balansi, daromadlar, regulyativ kapital hisob-kitobi, aktivlarni tasniflash va prudensial me’yorlar jadvallari, 2020–2025-yillar 30-dekabr holatiga.</w:t>
       </w:r>
     </w:p>
   </w:footnote>
@@ -8903,7 +8903,7 @@
         <w:t xml:space="preserve"> </w:t>
       </w:r>
       <w:r>
-        <w:t xml:space="preserve">Tadqiqot natijasida muallif tomonidan quyidagi manbalar ma’lumotlari asosida ishlab chiqildi: «O‘zsanoatqurilishbank» ATB ning Markaziy bankka taqdim etilgan prudensial hisobot shakllari (crs003C, crs003L, crs003O): bank balansi, daromadlar, regulyativ kapital hisob-kitobi, aktivlarni tasniflash va prudensial me’yorlar jadvallari, 2021–2025-yillar 30-dekabr holatiga; «Mikrokreditbank» ATB ning Markaziy bankka taqdim etilgan prudensial hisobot shakllari (crs005C, crs005L, crs005O): bank balansi, daromadlar, regulyativ kapital hisob-kitobi, aktivlarni tasniflash va prudensial me’yorlar jadvallari, 2021–2025-yillar 30-dekabr holatiga.</w:t>
+        <w:t xml:space="preserve">Tadqiqot natijasida muallif tomonidan quyidagi manbalar ma’lumotlari asosida ishlab chiqildi: «O‘zsanoatqurilishbank» ATB ning Markaziy bankka taqdim etilgan prudensial hisobot shakllari (crs003C, crs003L, crs003O): bank balansi, daromadlar, regulyativ kapital hisob-kitobi, aktivlarni tasniflash va prudensial me’yorlar jadvallari, 2020–2025-yillar 30-dekabr holatiga; «Mikrokreditbank» ATB ning Markaziy bankka taqdim etilgan prudensial hisobot shakllari (crs005C, crs005L, crs005O): bank balansi, daromadlar, regulyativ kapital hisob-kitobi, aktivlarni tasniflash va prudensial me’yorlar jadvallari, 2020–2025-yillar 30-dekabr holatiga.</w:t>
       </w:r>
     </w:p>
   </w:footnote>
@@ -8941,7 +8941,7 @@
         <w:t xml:space="preserve"> </w:t>
       </w:r>
       <w:r>
-        <w:t xml:space="preserve">Tadqiqot natijasida muallif tomonidan quyidagi manbalar ma’lumotlari asosida ishlab chiqildi: «O‘zsanoatqurilishbank» ATB ning Markaziy bankka taqdim etilgan prudensial hisobot shakllari (crs003C, crs003L, crs003O): bank balansi, daromadlar, regulyativ kapital hisob-kitobi, aktivlarni tasniflash va prudensial me’yorlar jadvallari, 2021–2025-yillar 30-dekabr holatiga; «Mikrokreditbank» ATB ning Markaziy bankka taqdim etilgan prudensial hisobot shakllari (crs005C, crs005L, crs005O): bank balansi, daromadlar, regulyativ kapital hisob-kitobi, aktivlarni tasniflash va prudensial me’yorlar jadvallari, 2021–2025-yillar 30-dekabr holatiga; Акционерный коммерческий банк «Узбекский промышленно-строительный банк» и его дочерние организации. Консолидированная финансовая отчетность за год, закончившийся 31 декабря 2021 года, и аудиторское заключение. – Ташкент, 2022. – С. 46; Акционерный коммерческий банк «Узбекский промышленно-строительный банк» и его дочерние организации. Консолидированная финансовая отчетность и аудиторское заключение за годы, закончившиеся 31 декабря 2023, 2022 и 2021 гг. – Ташкент, 2024. – С. 40; Joint Stock Commercial Bank «Uzbek Industrial and Construction Bank» and its subsidiaries. Consolidated Financial Statements for the year ended 31 December 2025 and Independent Auditor’s Report. – Tashkent, 2026. – P. 28–31; Акционерно-коммерческий банк «Микрокредитбанк». Финансовая отчетность за год, закончившийся 31 декабря 2021 года, и заключение независимых аудиторов. – Ташкент, 2022. – С. 42–43; Акционерно-коммерческий банк «Микрокредитбанк». Консолидированная финансовая отчетность за год, закончившийся 31 декабря 2024 года, и заключение независимых аудиторов. – Ташкент, 2025. – С. 49–51; Акционерно-коммерческий банк «Микрокредитбанк». Финансовая отчетность за год, закончившийся 31 декабря 2022 года, и заключение независимых аудиторов. – Ташкент, 2023. – С. 42–43; Акционерно-коммерческий банк «Микрокредитбанк». Консолидированная финансовая отчетность за год, закончившийся 31 декабря 2025 года, и заключение независимых аудиторов. – Ташкент, 2026. – С. 48. – https://mkbank.uz/uz/shareholders/financial-indicators/audit-report.</w:t>
+        <w:t xml:space="preserve">Tadqiqot natijasida muallif tomonidan quyidagi manbalar ma’lumotlari asosida ishlab chiqildi: «O‘zsanoatqurilishbank» ATB ning Markaziy bankka taqdim etilgan prudensial hisobot shakllari (crs003C, crs003L, crs003O): bank balansi, daromadlar, regulyativ kapital hisob-kitobi, aktivlarni tasniflash va prudensial me’yorlar jadvallari, 2020–2025-yillar 30-dekabr holatiga; «Mikrokreditbank» ATB ning Markaziy bankka taqdim etilgan prudensial hisobot shakllari (crs005C, crs005L, crs005O): bank balansi, daromadlar, regulyativ kapital hisob-kitobi, aktivlarni tasniflash va prudensial me’yorlar jadvallari, 2020–2025-yillar 30-dekabr holatiga; Акционерный коммерческий банк «Узбекский промышленно-строительный банк» и его дочерние организации. Консолидированная финансовая отчетность за год, закончившийся 31 декабря 2021 года, и аудиторское заключение. – Ташкент, 2022. – С. 46; Акционерный коммерческий банк «Узбекский промышленно-строительный банк» и его дочерние организации. Консолидированная финансовая отчетность и аудиторское заключение за годы, закончившиеся 31 декабря 2023, 2022 и 2021 гг. – Ташкент, 2024. – С. 40; Joint Stock Commercial Bank «Uzbek Industrial and Construction Bank» and its subsidiaries. Consolidated Financial Statements for the year ended 31 December 2025 and Independent Auditor’s Report. – Tashkent, 2026. – P. 28–31; Акционерно-коммерческий банк «Микрокредитбанк». Финансовая отчетность за год, закончившийся 31 декабря 2021 года, и заключение независимых аудиторов. – Ташкент, 2022. – С. 42–43; Акционерно-коммерческий банк «Микрокредитбанк». Консолидированная финансовая отчетность за год, закончившийся 31 декабря 2024 года, и заключение независимых аудиторов. – Ташкент, 2025. – С. 49–51; Акционерно-коммерческий банк «Микрокредитбанк». Финансовая отчетность за год, закончившийся 31 декабря 2022 года, и заключение независимых аудиторов. – Ташкент, 2023. – С. 42–43; Акционерно-коммерческий банк «Микрокредитбанк». Консолидированная финансовая отчетность за год, закончившийся 31 декабря 2025 года, и заключение независимых аудиторов. – Ташкент, 2026. – С. 48. – https://mkbank.uz/uz/shareholders/financial-indicators/audit-report.</w:t>
       </w:r>
     </w:p>
   </w:footnote>
@@ -9055,7 +9055,7 @@
         <w:t xml:space="preserve"> </w:t>
       </w:r>
       <w:r>
-        <w:t xml:space="preserve">Tadqiqot natijasida muallif tomonidan quyidagi manbalar ma’lumotlari asosida ishlab chiqildi: «O‘zsanoatqurilishbank» ATB ning Markaziy bankka taqdim etilgan prudensial hisobot shakllari (crs003C, crs003L, crs003O): bank balansi, daromadlar, regulyativ kapital hisob-kitobi, aktivlarni tasniflash va prudensial me’yorlar jadvallari, 2021–2025-yillar 30-dekabr holatiga; «Mikrokreditbank» ATB ning Markaziy bankka taqdim etilgan prudensial hisobot shakllari (crs005C, crs005L, crs005O): bank balansi, daromadlar, regulyativ kapital hisob-kitobi, aktivlarni tasniflash va prudensial me’yorlar jadvallari, 2021–2025-yillar 30-dekabr holatiga.</w:t>
+        <w:t xml:space="preserve">Tadqiqot natijasida muallif tomonidan quyidagi manbalar ma’lumotlari asosida ishlab chiqildi: «O‘zsanoatqurilishbank» ATB ning Markaziy bankka taqdim etilgan prudensial hisobot shakllari (crs003C, crs003L, crs003O): bank balansi, daromadlar, regulyativ kapital hisob-kitobi, aktivlarni tasniflash va prudensial me’yorlar jadvallari, 2020–2025-yillar 30-dekabr holatiga; «Mikrokreditbank» ATB ning Markaziy bankka taqdim etilgan prudensial hisobot shakllari (crs005C, crs005L, crs005O): bank balansi, daromadlar, regulyativ kapital hisob-kitobi, aktivlarni tasniflash va prudensial me’yorlar jadvallari, 2020–2025-yillar 30-dekabr holatiga.</w:t>
       </w:r>
     </w:p>
   </w:footnote>
@@ -9074,7 +9074,7 @@
         <w:t xml:space="preserve"> </w:t>
       </w:r>
       <w:r>
-        <w:t xml:space="preserve">«Mikrokreditbank» ATB ning Markaziy bankka taqdim etilgan prudensial hisobot shakllari (crs005C, crs005L, crs005O): bank balansi, daromadlar, regulyativ kapital hisob-kitobi, aktivlarni tasniflash va prudensial me’yorlar jadvallari, 2021–2025-yillar 30-dekabr holatiga.</w:t>
+        <w:t xml:space="preserve">«Mikrokreditbank» ATB ning Markaziy bankka taqdim etilgan prudensial hisobot shakllari (crs005C, crs005L, crs005O): bank balansi, daromadlar, regulyativ kapital hisob-kitobi, aktivlarni tasniflash va prudensial me’yorlar jadvallari, 2020–2025-yillar 30-dekabr holatiga.</w:t>
       </w:r>
     </w:p>
   </w:footnote>
@@ -9093,7 +9093,7 @@
         <w:t xml:space="preserve"> </w:t>
       </w:r>
       <w:r>
-        <w:t xml:space="preserve">«O‘zsanoatqurilishbank» ATB ning Markaziy bankka taqdim etilgan prudensial hisobot shakllari (crs003C, crs003L, crs003O): bank balansi, daromadlar, regulyativ kapital hisob-kitobi, aktivlarni tasniflash va prudensial me’yorlar jadvallari, 2021–2025-yillar 30-dekabr holatiga.</w:t>
+        <w:t xml:space="preserve">«O‘zsanoatqurilishbank» ATB ning Markaziy bankka taqdim etilgan prudensial hisobot shakllari (crs003C, crs003L, crs003O): bank balansi, daromadlar, regulyativ kapital hisob-kitobi, aktivlarni tasniflash va prudensial me’yorlar jadvallari, 2020–2025-yillar 30-dekabr holatiga.</w:t>
       </w:r>
     </w:p>
   </w:footnote>
@@ -9112,7 +9112,7 @@
         <w:t xml:space="preserve"> </w:t>
       </w:r>
       <w:r>
-        <w:t xml:space="preserve">Tadqiqot natijasida muallif tomonidan quyidagi manbalar ma’lumotlari asosida ishlab chiqildi: O‘zbekiston Respublikasi Markaziy banki. Statistik byulleten: 2021-yil. – Toshkent, 2022. – 5.1.8b-jadval; O‘zbekiston Respublikasi Markaziy banki. Statistik byulleten: 2026-yil mart. – Toshkent, 2026. – 5.1.2, 5.1.3, 5.1.4, 5.1.6, 5.1.7, 5.1.8-jadvallar. – https://cbu.uz/uz/statistics/buleten; The Central Bank of the Republic of Uzbekistan. Financial Stability Report for 2025. – Tashkent, 2026; World Bank. Republic of Uzbekistan: Financial Sector Assessment. – Washington, DC: World Bank, 2025; «O‘zsanoatqurilishbank» ATB ning Markaziy bankka taqdim etilgan prudensial hisobot shakllari (crs003C, crs003L, crs003O): bank balansi, daromadlar, regulyativ kapital hisob-kitobi, aktivlarni tasniflash va prudensial me’yorlar jadvallari, 2021–2025-yillar 30-dekabr holatiga; «Mikrokreditbank» ATB ning Markaziy bankka taqdim etilgan prudensial hisobot shakllari (crs005C, crs005L, crs005O): bank balansi, daromadlar, regulyativ kapital hisob-kitobi, aktivlarni tasniflash va prudensial me’yorlar jadvallari, 2021–2025-yillar 30-dekabr holatiga; Joint Stock Commercial Bank «Uzbek Industrial and Construction Bank» and its subsidiaries. Consolidated Financial Statements for the year ended 31 December 2025 and Independent Auditor’s Report. – Tashkent, 2026. – P. 28–31; Акционерно-коммерческий банк «Микрокредитбанк». Финансовая отчетность за год, закончившийся 31 декабря 2021 года, и заключение независимых аудиторов. – Ташкент, 2022. – С. 42–43; Акционерно-коммерческий банк «Микрокредитбанк». Консолидированная финансовая отчетность за год, закончившийся 31 декабря 2024 года, и заключение независимых аудиторов. – Ташкент, 2025. – С. 49–51; Акционерно-коммерческий банк «Микрокредитбанк». Финансовая отчетность за год, закончившийся 31 декабря 2022 года, и заключение независимых аудиторов. – Ташкент, 2023. – С. 42–43; Акционерно-коммерческий банк «Микрокредитбанк». Консолидированная финансовая отчетность за год, закончившийся 31 декабря 2025 года, и заключение независимых аудиторов. – Ташкент, 2026. – С. 48. – https://mkbank.uz/uz/shareholders/financial-indicators/audit-report.</w:t>
+        <w:t xml:space="preserve">Tadqiqot natijasida muallif tomonidan quyidagi manbalar ma’lumotlari asosida ishlab chiqildi: O‘zbekiston Respublikasi Markaziy banki. Statistik byulleten: 2021-yil. – Toshkent, 2022. – 5.1.8b-jadval; O‘zbekiston Respublikasi Markaziy banki. Statistik byulleten: 2026-yil mart. – Toshkent, 2026. – 5.1.2, 5.1.3, 5.1.4, 5.1.6, 5.1.7, 5.1.8-jadvallar. – https://cbu.uz/uz/statistics/buleten; The Central Bank of the Republic of Uzbekistan. Financial Stability Report for 2025. – Tashkent, 2026; World Bank. Republic of Uzbekistan: Financial Sector Assessment. – Washington, DC: World Bank, 2025; «O‘zsanoatqurilishbank» ATB ning Markaziy bankka taqdim etilgan prudensial hisobot shakllari (crs003C, crs003L, crs003O): bank balansi, daromadlar, regulyativ kapital hisob-kitobi, aktivlarni tasniflash va prudensial me’yorlar jadvallari, 2020–2025-yillar 30-dekabr holatiga; «Mikrokreditbank» ATB ning Markaziy bankka taqdim etilgan prudensial hisobot shakllari (crs005C, crs005L, crs005O): bank balansi, daromadlar, regulyativ kapital hisob-kitobi, aktivlarni tasniflash va prudensial me’yorlar jadvallari, 2020–2025-yillar 30-dekabr holatiga; Joint Stock Commercial Bank «Uzbek Industrial and Construction Bank» and its subsidiaries. Consolidated Financial Statements for the year ended 31 December 2025 and Independent Auditor’s Report. – Tashkent, 2026. – P. 28–31; Акционерно-коммерческий банк «Микрокредитбанк». Финансовая отчетность за год, закончившийся 31 декабря 2021 года, и заключение независимых аудиторов. – Ташкент, 2022. – С. 42–43; Акционерно-коммерческий банк «Микрокредитбанк». Консолидированная финансовая отчетность за год, закончившийся 31 декабря 2024 года, и заключение независимых аудиторов. – Ташкент, 2025. – С. 49–51; Акционерно-коммерческий банк «Микрокредитбанк». Финансовая отчетность за год, закончившийся 31 декабря 2022 года, и заключение независимых аудиторов. – Ташкент, 2023. – С. 42–43; Акционерно-коммерческий банк «Микрокредитбанк». Консолидированная финансовая отчетность за год, закончившийся 31 декабря 2025 года, и заключение независимых аудиторов. – Ташкент, 2026. – С. 48. – https://mkbank.uz/uz/shareholders/financial-indicators/audit-report.</w:t>
       </w:r>
     </w:p>
   </w:footnote>
@@ -13209,7 +13209,7 @@
                 <c:formatCode>General</c:formatCode>
                 <c:ptCount val="5"/>
                 <c:pt idx="0">
-                  <c:v>16.0</c:v>
+                  <c:v>17.1</c:v>
                 </c:pt>
                 <c:pt idx="1">
                   <c:v>7.6</c:v>
@@ -13314,7 +13314,7 @@
                 <c:formatCode>General</c:formatCode>
                 <c:ptCount val="5"/>
                 <c:pt idx="0">
-                  <c:v>2.2</c:v>
+                  <c:v>2.5</c:v>
                 </c:pt>
                 <c:pt idx="1">
                   <c:v>0.7</c:v>

</xml_diff>

<commit_message>
2021-yil sof foyda tuzatildi: soliqdan oldingi emas, soliqdan keyingi qiymat (SQB 998,2; MKB 38,4)
Co-Authored-By: Claude Opus 5.5 <noreply@anthropic.com>
Claude-Session: https://claude.ai/code/session_01PxHTC8Q7yHdrpAeUA5KUgM
</commit_message>
<xml_diff>
--- a/paragraflar/2.2-paragraf.docx
+++ b/paragraflar/2.2-paragraf.docx
@@ -4447,7 +4447,7 @@
                 <w:rFonts w:ascii="Times New Roman" w:hAnsi="Times New Roman" w:cs="Times New Roman" w:eastAsia="Times New Roman"/>
                 <w:sz w:val="22"/>
               </w:rPr>
-              <w:t xml:space="preserve">2,3</w:t>
+              <w:t xml:space="preserve">1,9</w:t>
             </w:r>
           </w:p>
         </w:tc>
@@ -4572,7 +4572,7 @@
                 <w:rFonts w:ascii="Times New Roman" w:hAnsi="Times New Roman" w:cs="Times New Roman" w:eastAsia="Times New Roman"/>
                 <w:sz w:val="22"/>
               </w:rPr>
-              <w:t xml:space="preserve">17,1</w:t>
+              <w:t xml:space="preserve">13,9</w:t>
             </w:r>
           </w:p>
         </w:tc>
@@ -5791,7 +5791,7 @@
                 <w:rFonts w:ascii="Times New Roman" w:hAnsi="Times New Roman" w:cs="Times New Roman" w:eastAsia="Times New Roman"/>
                 <w:sz w:val="22"/>
               </w:rPr>
-              <w:t xml:space="preserve">0,4</w:t>
+              <w:t xml:space="preserve">0,3</w:t>
             </w:r>
           </w:p>
         </w:tc>
@@ -5916,7 +5916,7 @@
                 <w:rFonts w:ascii="Times New Roman" w:hAnsi="Times New Roman" w:cs="Times New Roman" w:eastAsia="Times New Roman"/>
                 <w:sz w:val="22"/>
               </w:rPr>
-              <w:t xml:space="preserve">2,5</w:t>
+              <w:t xml:space="preserve">1,9</w:t>
             </w:r>
           </w:p>
         </w:tc>
@@ -6776,7 +6776,7 @@
           <w:rFonts w:ascii="Times New Roman" w:hAnsi="Times New Roman" w:cs="Times New Roman" w:eastAsia="Times New Roman"/>
           <w:sz w:val="28"/>
         </w:rPr>
-        <w:t xml:space="preserve">Rasm ma’lumotlari shuni ko‘rsatadiki, «O‘zsanoatqurilishbank» ATB ning kapital rentabelligi 2022-yildagi pasayishdan keyin tiklanib, 2025-yilda 17,2 foizga yetgan, ya’ni tizim o‘rtacha darajasidan yuqori. «Mikrokreditbank» ATB da esa ROE 2021–2023-yillarda 0,7–2,5 foiz bilan inflyatsiya darajasidan ancha past bo‘lgan, 2024-yilda esa bank 1 703,8 mlrd so‘m zarar ko‘rgan. Bu zarar aktivlar bo‘yicha ehtimoliy yo‘qotishlarga qarshi zaxiralarning keskin oshirilishi natijasida yuzaga kelgan: zaxiralar ajratilgandan keyingi sof foizli daromad 1 167,3 mlrd so‘m zararni tashkil etgan</w:t>
+        <w:t xml:space="preserve">Rasm ma’lumotlari shuni ko‘rsatadiki, «O‘zsanoatqurilishbank» ATB ning kapital rentabelligi 2022-yildagi pasayishdan keyin tiklanib, 2025-yilda 17,2 foizga yetgan, ya’ni tizim o‘rtacha darajasidan yuqori. «Mikrokreditbank» ATB da esa ROE 2021–2023-yillarda 0,7–1,9 foiz bilan inflyatsiya darajasidan ancha past bo‘lgan, 2024-yilda esa bank 1 703,8 mlrd so‘m zarar ko‘rgan. Bu zarar aktivlar bo‘yicha ehtimoliy yo‘qotishlarga qarshi zaxiralarning keskin oshirilishi natijasida yuzaga kelgan: zaxiralar ajratilgandan keyingi sof foizli daromad 1 167,3 mlrd so‘m zararni tashkil etgan</w:t>
       </w:r>
       <w:r>
         <w:rPr>
@@ -13209,7 +13209,7 @@
                 <c:formatCode>General</c:formatCode>
                 <c:ptCount val="5"/>
                 <c:pt idx="0">
-                  <c:v>17.1</c:v>
+                  <c:v>13.9</c:v>
                 </c:pt>
                 <c:pt idx="1">
                   <c:v>7.6</c:v>
@@ -13314,7 +13314,7 @@
                 <c:formatCode>General</c:formatCode>
                 <c:ptCount val="5"/>
                 <c:pt idx="0">
-                  <c:v>2.5</c:v>
+                  <c:v>1.9</c:v>
                 </c:pt>
                 <c:pt idx="1">
                   <c:v>0.7</c:v>

</xml_diff>